<commit_message>
pharmacy assist training added
</commit_message>
<xml_diff>
--- a/primaryResume.docx
+++ b/primaryResume.docx
@@ -1151,7 +1151,22 @@
           <w:rFonts w:cs="Calibri" w:ascii="Calibri" w:hAnsi="Calibri"/>
           <w:lang w:val="en-CA"/>
         </w:rPr>
-        <w:t>Cashier &amp; Merchandiser</w:t>
+        <w:t xml:space="preserve">Cashier &amp; Merchandiser </w:t>
+      </w:r>
+      <w:r>
+        <w:rPr>
+          <w:rStyle w:val="NormalItalic"/>
+          <w:rFonts w:cs="Calibri" w:ascii="Calibri" w:hAnsi="Calibri"/>
+          <w:lang w:val="en-CA"/>
+        </w:rPr>
+        <w:t>(also assist in pharmacy)</w:t>
+      </w:r>
+      <w:r>
+        <w:rPr>
+          <w:rStyle w:val="NormalItalic"/>
+          <w:rFonts w:cs="Calibri" w:ascii="Calibri" w:hAnsi="Calibri"/>
+          <w:lang w:val="en-CA"/>
+        </w:rPr>
         <w:tab/>
       </w:r>
       <w:r>
@@ -1320,6 +1335,27 @@
           <w:lang w:val="en-CA"/>
         </w:rPr>
         <w:t>Perform merchandising tasks such as: maintaining a temperature log, checking expiry dates, using a PDT (to print price tags, bin excess inventory, check prices and, check planogram when restocking.</w:t>
+      </w:r>
+    </w:p>
+    <w:p>
+      <w:pPr>
+        <w:pStyle w:val="ListParagraph"/>
+        <w:numPr>
+          <w:ilvl w:val="0"/>
+          <w:numId w:val="4"/>
+        </w:numPr>
+        <w:spacing w:before="0" w:after="0"/>
+        <w:rPr>
+          <w:rFonts w:ascii="Calibri" w:hAnsi="Calibri" w:cs="Calibri"/>
+          <w:lang w:val="en-CA"/>
+        </w:rPr>
+      </w:pPr>
+      <w:r>
+        <w:rPr>
+          <w:rFonts w:cs="Calibri" w:ascii="Calibri" w:hAnsi="Calibri"/>
+          <w:lang w:val="en-CA"/>
+        </w:rPr>
+        <w:t>Assist in pharmacy at cash, preparing delivery orders including payment. Calling customers when their prescriptions are ready for pickup. Sort prepared prescriptions and, recently received drugs. Sign-up customers for the online pharmacy.</w:t>
       </w:r>
     </w:p>
     <w:p>

</xml_diff>

<commit_message>
updated addresses and activities
</commit_message>
<xml_diff>
--- a/primaryResume.docx
+++ b/primaryResume.docx
@@ -5,6 +5,10 @@
     <w:p>
       <w:pPr>
         <w:pStyle w:val="Name"/>
+        <w:tabs>
+          <w:tab w:val="left" w:pos="2833" w:leader="none"/>
+          <w:tab w:val="right" w:pos="9360" w:leader="none"/>
+        </w:tabs>
         <w:spacing w:before="120" w:after="120"/>
         <w:rPr>
           <w:sz w:val="32"/>
@@ -21,46 +25,195 @@
         <w:t>Sheldon W. B. Maschmeyer</w:t>
       </w:r>
     </w:p>
-    <w:p>
-      <w:pPr>
-        <w:pStyle w:val="ContactInfo"/>
-        <w:rPr>
-          <w:rFonts w:ascii="Arial" w:hAnsi="Arial"/>
-          <w:sz w:val="18"/>
-          <w:szCs w:val="18"/>
-          <w:lang w:val="en-CA"/>
-        </w:rPr>
-      </w:pPr>
-      <w:r>
-        <w:rPr>
-          <w:rFonts w:ascii="Arial" w:hAnsi="Arial"/>
-          <w:sz w:val="18"/>
-          <w:szCs w:val="18"/>
-          <w:lang w:val="en-CA"/>
-        </w:rPr>
-        <w:t>562 Reardon Private, Ottawa, Ontario, Canada, K1V 2L1</w:t>
-      </w:r>
-    </w:p>
-    <w:p>
-      <w:pPr>
-        <w:pStyle w:val="ContactInfo"/>
-        <w:rPr>
-          <w:rFonts w:ascii="Arial" w:hAnsi="Arial"/>
-          <w:sz w:val="18"/>
-          <w:szCs w:val="18"/>
-          <w:lang w:val="en-CA"/>
-        </w:rPr>
-      </w:pPr>
-      <w:r>
-        <w:rPr>
-          <w:rFonts w:ascii="Arial" w:hAnsi="Arial"/>
-          <w:sz w:val="18"/>
-          <w:szCs w:val="18"/>
-          <w:lang w:val="en-CA"/>
-        </w:rPr>
-        <w:t>613-889-4320 | sheldon@maschmeyer.ca</w:t>
-      </w:r>
-    </w:p>
+    <w:tbl>
+      <w:tblPr>
+        <w:tblW w:w="4386" w:type="dxa"/>
+        <w:jc w:val="center"/>
+        <w:tblInd w:w="0" w:type="dxa"/>
+        <w:tblCellMar>
+          <w:top w:w="55" w:type="dxa"/>
+          <w:left w:w="55" w:type="dxa"/>
+          <w:bottom w:w="55" w:type="dxa"/>
+          <w:right w:w="55" w:type="dxa"/>
+        </w:tblCellMar>
+      </w:tblPr>
+      <w:tblGrid>
+        <w:gridCol w:w="1813"/>
+        <w:gridCol w:w="2573"/>
+      </w:tblGrid>
+      <w:tr>
+        <w:trPr/>
+        <w:tc>
+          <w:tcPr>
+            <w:tcW w:w="1813" w:type="dxa"/>
+            <w:tcBorders/>
+          </w:tcPr>
+          <w:p>
+            <w:pPr>
+              <w:pStyle w:val="ContactInfo"/>
+              <w:rPr/>
+            </w:pPr>
+            <w:r>
+              <w:rPr/>
+              <w:t>Ottawa, Ontario</w:t>
+            </w:r>
+          </w:p>
+        </w:tc>
+        <w:tc>
+          <w:tcPr>
+            <w:tcW w:w="2573" w:type="dxa"/>
+            <w:tcBorders/>
+          </w:tcPr>
+          <w:p>
+            <w:pPr>
+              <w:pStyle w:val="ContactInfo"/>
+              <w:jc w:val="left"/>
+              <w:rPr>
+                <w:rFonts w:ascii="arial" w:hAnsi="arial"/>
+                <w:sz w:val="18"/>
+                <w:szCs w:val="18"/>
+                <w:lang w:val="en-CA"/>
+              </w:rPr>
+            </w:pPr>
+            <w:r>
+              <w:rPr>
+                <w:rFonts w:ascii="arial" w:hAnsi="arial"/>
+                <w:sz w:val="18"/>
+                <w:szCs w:val="18"/>
+                <w:lang w:val="en-CA"/>
+              </w:rPr>
+              <w:t>562 Reardon Private, K1V 2L1</w:t>
+            </w:r>
+          </w:p>
+        </w:tc>
+      </w:tr>
+      <w:tr>
+        <w:trPr/>
+        <w:tc>
+          <w:tcPr>
+            <w:tcW w:w="1813" w:type="dxa"/>
+            <w:tcBorders/>
+          </w:tcPr>
+          <w:p>
+            <w:pPr>
+              <w:pStyle w:val="ContactInfo"/>
+              <w:tabs>
+                <w:tab w:val="clear" w:pos="9360"/>
+              </w:tabs>
+              <w:jc w:val="right"/>
+              <w:rPr>
+                <w:rFonts w:ascii="arial" w:hAnsi="arial"/>
+                <w:sz w:val="18"/>
+                <w:szCs w:val="18"/>
+                <w:lang w:val="en-CA"/>
+              </w:rPr>
+            </w:pPr>
+            <w:r>
+              <w:rPr>
+                <w:rFonts w:ascii="arial" w:hAnsi="arial"/>
+                <w:sz w:val="18"/>
+                <w:szCs w:val="18"/>
+                <w:lang w:val="en-CA"/>
+              </w:rPr>
+              <w:t xml:space="preserve">Mississauga, </w:t>
+            </w:r>
+            <w:r>
+              <w:rPr>
+                <w:rFonts w:ascii="arial" w:hAnsi="arial"/>
+                <w:sz w:val="18"/>
+                <w:szCs w:val="18"/>
+                <w:lang w:val="en-CA"/>
+              </w:rPr>
+              <w:t>Ontario</w:t>
+            </w:r>
+          </w:p>
+        </w:tc>
+        <w:tc>
+          <w:tcPr>
+            <w:tcW w:w="2573" w:type="dxa"/>
+            <w:tcBorders/>
+          </w:tcPr>
+          <w:p>
+            <w:pPr>
+              <w:pStyle w:val="ContactInfo"/>
+              <w:jc w:val="left"/>
+              <w:rPr>
+                <w:rFonts w:ascii="arial" w:hAnsi="arial"/>
+                <w:sz w:val="18"/>
+                <w:szCs w:val="18"/>
+                <w:lang w:val="en-CA"/>
+              </w:rPr>
+            </w:pPr>
+            <w:r>
+              <w:rPr>
+                <w:rFonts w:ascii="arial" w:hAnsi="arial"/>
+                <w:sz w:val="18"/>
+                <w:szCs w:val="18"/>
+                <w:lang w:val="en-CA"/>
+              </w:rPr>
+              <w:t>4060 Farrier Court, L5L 2Y4</w:t>
+            </w:r>
+          </w:p>
+        </w:tc>
+      </w:tr>
+      <w:tr>
+        <w:trPr/>
+        <w:tc>
+          <w:tcPr>
+            <w:tcW w:w="1813" w:type="dxa"/>
+            <w:tcBorders/>
+          </w:tcPr>
+          <w:p>
+            <w:pPr>
+              <w:pStyle w:val="ContactInfo"/>
+              <w:jc w:val="right"/>
+              <w:rPr>
+                <w:rFonts w:ascii="arial" w:hAnsi="arial"/>
+                <w:sz w:val="18"/>
+                <w:szCs w:val="18"/>
+                <w:lang w:val="en-CA"/>
+              </w:rPr>
+            </w:pPr>
+            <w:r>
+              <w:rPr>
+                <w:rFonts w:ascii="arial" w:hAnsi="arial"/>
+                <w:sz w:val="18"/>
+                <w:szCs w:val="18"/>
+                <w:lang w:val="en-CA"/>
+              </w:rPr>
+              <w:t>613-889-4320</w:t>
+            </w:r>
+          </w:p>
+        </w:tc>
+        <w:tc>
+          <w:tcPr>
+            <w:tcW w:w="2573" w:type="dxa"/>
+            <w:tcBorders/>
+          </w:tcPr>
+          <w:p>
+            <w:pPr>
+              <w:pStyle w:val="ContactInfo"/>
+              <w:jc w:val="left"/>
+              <w:rPr>
+                <w:rFonts w:ascii="arial" w:hAnsi="arial"/>
+                <w:sz w:val="18"/>
+                <w:szCs w:val="18"/>
+                <w:lang w:val="en-CA"/>
+              </w:rPr>
+            </w:pPr>
+            <w:r>
+              <w:rPr>
+                <w:rFonts w:ascii="arial" w:hAnsi="arial"/>
+                <w:sz w:val="18"/>
+                <w:szCs w:val="18"/>
+                <w:lang w:val="en-CA"/>
+              </w:rPr>
+              <w:t>sheldon@maschmeyer.ca</w:t>
+            </w:r>
+          </w:p>
+        </w:tc>
+      </w:tr>
+    </w:tbl>
     <w:p>
       <w:pPr>
         <w:pStyle w:val="Heading1"/>
@@ -1166,6 +1319,12 @@
         <w:ind w:left="0" w:right="0" w:hanging="0"/>
         <w:rPr>
           <w:rFonts w:ascii="Helvetica;Arial;sans-serif" w:hAnsi="Helvetica;Arial;sans-serif"/>
+          <w:u w:val="none"/>
+        </w:rPr>
+      </w:pPr>
+      <w:r>
+        <w:rPr>
+          <w:rFonts w:cs="Calibri" w:ascii="Calibri" w:hAnsi="Calibri"/>
           <w:b w:val="false"/>
           <w:i w:val="false"/>
           <w:caps w:val="false"/>
@@ -1175,8 +1334,10 @@
           <w:sz w:val="22"/>
           <w:szCs w:val="22"/>
           <w:u w:val="none"/>
-        </w:rPr>
-      </w:pPr>
+          <w:lang w:val="en-CA"/>
+        </w:rPr>
+        <w:t xml:space="preserve">Shoppers Drug Mart is leading drug store retailer providing a broad range of products and services in health, beauty and convenience. Our location is open till midnight. </w:t>
+      </w:r>
       <w:r>
         <w:rPr>
           <w:rFonts w:cs="Calibri" w:ascii="Calibri" w:hAnsi="Calibri"/>
@@ -1191,7 +1352,7 @@
           <w:u w:val="none"/>
           <w:lang w:val="en-CA"/>
         </w:rPr>
-        <w:t xml:space="preserve">Shoppers Drug Mart is leading drug store retailer providing a broad range of products and services in health, beauty and convenience. Our location is open till midnight. </w:t>
+        <w:t>Our location r</w:t>
       </w:r>
       <w:r>
         <w:rPr>
@@ -1207,40 +1368,7 @@
           <w:u w:val="none"/>
           <w:lang w:val="en-CA"/>
         </w:rPr>
-        <w:t>Our location r</w:t>
-      </w:r>
-      <w:r>
-        <w:rPr>
-          <w:rFonts w:cs="Calibri" w:ascii="Calibri" w:hAnsi="Calibri"/>
-          <w:b w:val="false"/>
-          <w:i w:val="false"/>
-          <w:caps w:val="false"/>
-          <w:smallCaps w:val="false"/>
-          <w:color w:val="232323"/>
-          <w:spacing w:val="0"/>
-          <w:sz w:val="22"/>
-          <w:szCs w:val="22"/>
-          <w:u w:val="none"/>
-          <w:lang w:val="en-CA"/>
-        </w:rPr>
         <w:t>ecently expanded the grocery section, providing fresh produce, easy meals and self checkouts.</w:t>
-      </w:r>
-    </w:p>
-    <w:p>
-      <w:pPr>
-        <w:pStyle w:val="ListParagraph"/>
-        <w:rPr>
-          <w:rFonts w:ascii="Calibri" w:hAnsi="Calibri" w:cs="Calibri"/>
-          <w:u w:val="single"/>
-          <w:lang w:val="en-CA"/>
-        </w:rPr>
-      </w:pPr>
-      <w:r>
-        <w:rPr>
-          <w:rFonts w:cs="Calibri" w:ascii="Calibri" w:hAnsi="Calibri"/>
-          <w:u w:val="single"/>
-          <w:lang w:val="en-CA"/>
-        </w:rPr>
       </w:r>
     </w:p>
     <w:p>
@@ -2801,7 +2929,7 @@
           <w:kern w:val="0"/>
           <w:lang w:val="en-CA" w:eastAsia="en-CA"/>
         </w:rPr>
-        <w:t xml:space="preserve">Pre-pandemic, </w:t>
+        <w:t>Early March</w:t>
       </w:r>
       <w:r>
         <w:rPr>
@@ -2814,7 +2942,7 @@
           <w:kern w:val="0"/>
           <w:lang w:val="en-CA" w:eastAsia="en-CA"/>
         </w:rPr>
-        <w:t>went to</w:t>
+        <w:t xml:space="preserve">, </w:t>
       </w:r>
       <w:r>
         <w:rPr>
@@ -2827,7 +2955,7 @@
           <w:kern w:val="0"/>
           <w:lang w:val="en-CA" w:eastAsia="en-CA"/>
         </w:rPr>
-        <w:t xml:space="preserve"> </w:t>
+        <w:t>went to</w:t>
       </w:r>
       <w:r>
         <w:rPr>
@@ -2840,7 +2968,7 @@
           <w:kern w:val="0"/>
           <w:lang w:val="en-CA" w:eastAsia="en-CA"/>
         </w:rPr>
-        <w:t>sister’s wedding and vacat</w:t>
+        <w:t xml:space="preserve"> </w:t>
       </w:r>
       <w:r>
         <w:rPr>
@@ -2853,7 +2981,7 @@
           <w:kern w:val="0"/>
           <w:lang w:val="en-CA" w:eastAsia="en-CA"/>
         </w:rPr>
-        <w:t>ioned</w:t>
+        <w:t xml:space="preserve">sister </w:t>
       </w:r>
       <w:r>
         <w:rPr>
@@ -2866,7 +2994,7 @@
           <w:kern w:val="0"/>
           <w:lang w:val="en-CA" w:eastAsia="en-CA"/>
         </w:rPr>
-        <w:t xml:space="preserve"> with international friends in </w:t>
+        <w:t>and Ken</w:t>
       </w:r>
       <w:r>
         <w:rPr>
@@ -2879,7 +3007,7 @@
           <w:kern w:val="0"/>
           <w:lang w:val="en-CA" w:eastAsia="en-CA"/>
         </w:rPr>
-        <w:t xml:space="preserve">Florida. </w:t>
+        <w:t>’s wedding and vacat</w:t>
       </w:r>
       <w:r>
         <w:rPr>
@@ -2892,55 +3020,33 @@
           <w:kern w:val="0"/>
           <w:lang w:val="en-CA" w:eastAsia="en-CA"/>
         </w:rPr>
-        <w:t xml:space="preserve">During pandemic, </w:t>
-      </w:r>
-      <w:r>
-        <w:rPr>
+        <w:t>ioned</w:t>
+      </w:r>
+      <w:r>
+        <w:rPr>
+          <w:rStyle w:val="NormalItalic"/>
           <w:rFonts w:eastAsia="Times New Roman" w:cs="Calibri" w:ascii="Calibri" w:hAnsi="Calibri"/>
           <w:b w:val="false"/>
           <w:bCs w:val="false"/>
           <w:i w:val="false"/>
           <w:iCs w:val="false"/>
           <w:kern w:val="0"/>
-          <w:lang w:eastAsia="en-CA"/>
-        </w:rPr>
-        <w:t xml:space="preserve">I have been playing Jackbox </w:t>
-      </w:r>
-      <w:r>
-        <w:rPr>
+          <w:lang w:val="en-CA" w:eastAsia="en-CA"/>
+        </w:rPr>
+        <w:t xml:space="preserve"> with friends in </w:t>
+      </w:r>
+      <w:r>
+        <w:rPr>
+          <w:rStyle w:val="NormalItalic"/>
           <w:rFonts w:eastAsia="Times New Roman" w:cs="Calibri" w:ascii="Calibri" w:hAnsi="Calibri"/>
           <w:b w:val="false"/>
           <w:bCs w:val="false"/>
           <w:i w:val="false"/>
           <w:iCs w:val="false"/>
           <w:kern w:val="0"/>
-          <w:lang w:eastAsia="en-CA"/>
-        </w:rPr>
-        <w:t xml:space="preserve">and Fortnite </w:t>
-      </w:r>
-      <w:r>
-        <w:rPr>
-          <w:rFonts w:eastAsia="Times New Roman" w:cs="Calibri" w:ascii="Calibri" w:hAnsi="Calibri"/>
-          <w:b w:val="false"/>
-          <w:bCs w:val="false"/>
-          <w:i w:val="false"/>
-          <w:iCs w:val="false"/>
-          <w:kern w:val="0"/>
-          <w:lang w:eastAsia="en-CA"/>
-        </w:rPr>
-        <w:t>and other online video games</w:t>
-      </w:r>
-      <w:r>
-        <w:rPr>
-          <w:rFonts w:eastAsia="Times New Roman" w:cs="Calibri" w:ascii="Calibri" w:hAnsi="Calibri"/>
-          <w:b w:val="false"/>
-          <w:bCs w:val="false"/>
-          <w:i w:val="false"/>
-          <w:iCs w:val="false"/>
-          <w:kern w:val="0"/>
-          <w:lang w:eastAsia="en-CA"/>
-        </w:rPr>
-        <w:t xml:space="preserve"> with local and international friends. </w:t>
+          <w:lang w:val="en-CA" w:eastAsia="en-CA"/>
+        </w:rPr>
+        <w:t>Florida.</w:t>
       </w:r>
     </w:p>
     <w:sectPr>
@@ -4273,6 +4379,28 @@
       <w:szCs w:val="18"/>
     </w:rPr>
   </w:style>
+  <w:style w:type="paragraph" w:styleId="TableContents">
+    <w:name w:val="Table Contents"/>
+    <w:basedOn w:val="Normal"/>
+    <w:qFormat/>
+    <w:pPr>
+      <w:suppressLineNumbers/>
+    </w:pPr>
+    <w:rPr/>
+  </w:style>
+  <w:style w:type="paragraph" w:styleId="TableHeading">
+    <w:name w:val="Table Heading"/>
+    <w:basedOn w:val="TableContents"/>
+    <w:qFormat/>
+    <w:pPr>
+      <w:suppressLineNumbers/>
+      <w:jc w:val="center"/>
+    </w:pPr>
+    <w:rPr>
+      <w:b/>
+      <w:bCs/>
+    </w:rPr>
+  </w:style>
   <w:style w:type="numbering" w:styleId="Bullet">
     <w:name w:val="Bullet •"/>
     <w:qFormat/>

</xml_diff>

<commit_message>
removed references to asthma and impact, show no weakness
</commit_message>
<xml_diff>
--- a/primaryResume.docx
+++ b/primaryResume.docx
@@ -51,11 +51,27 @@
           <w:p>
             <w:pPr>
               <w:pStyle w:val="ContactInfo"/>
-              <w:rPr/>
+              <w:rPr>
+                <w:rFonts w:ascii="ariel" w:hAnsi="ariel"/>
+                <w:sz w:val="18"/>
+                <w:szCs w:val="18"/>
+              </w:rPr>
             </w:pPr>
             <w:r>
-              <w:rPr/>
-              <w:t>Ottawa, Ontario</w:t>
+              <w:rPr>
+                <w:rFonts w:ascii="arial" w:hAnsi="arial"/>
+                <w:sz w:val="18"/>
+                <w:szCs w:val="18"/>
+              </w:rPr>
+              <w:t>Ottawa</w:t>
+            </w:r>
+            <w:r>
+              <w:rPr>
+                <w:rFonts w:ascii="ariel" w:hAnsi="ariel"/>
+                <w:sz w:val="18"/>
+                <w:szCs w:val="18"/>
+              </w:rPr>
+              <w:t>, Ontario</w:t>
             </w:r>
           </w:p>
         </w:tc>
@@ -399,65 +415,6 @@
     </w:p>
     <w:p>
       <w:pPr>
-        <w:pStyle w:val="ListParagraph"/>
-        <w:numPr>
-          <w:ilvl w:val="0"/>
-          <w:numId w:val="2"/>
-        </w:numPr>
-        <w:tabs>
-          <w:tab w:val="clear" w:pos="9360"/>
-        </w:tabs>
-        <w:spacing w:before="0" w:after="0"/>
-        <w:rPr>
-          <w:rFonts w:ascii="Calibri" w:hAnsi="Calibri" w:cs="Calibri"/>
-          <w:lang w:val="en-CA"/>
-        </w:rPr>
-      </w:pPr>
-      <w:r>
-        <w:rPr>
-          <w:rFonts w:cs="Calibri" w:ascii="Calibri" w:hAnsi="Calibri"/>
-          <w:lang w:val="en-CA"/>
-        </w:rPr>
-        <w:t xml:space="preserve">Had health issues during school years, </w:t>
-      </w:r>
-      <w:r>
-        <w:rPr>
-          <w:rFonts w:cs="Calibri" w:ascii="Calibri" w:hAnsi="Calibri"/>
-          <w:lang w:val="en-CA"/>
-        </w:rPr>
-        <w:t>especially secondary school,</w:t>
-      </w:r>
-      <w:r>
-        <w:rPr>
-          <w:rFonts w:cs="Calibri" w:ascii="Calibri" w:hAnsi="Calibri"/>
-          <w:lang w:val="en-CA"/>
-        </w:rPr>
-        <w:t xml:space="preserve"> which delayed the start of university </w:t>
-      </w:r>
-      <w:r>
-        <w:rPr>
-          <w:rFonts w:cs="Calibri" w:ascii="Calibri" w:hAnsi="Calibri"/>
-          <w:lang w:val="en-CA"/>
-        </w:rPr>
-        <w:t>and career</w:t>
-      </w:r>
-      <w:r>
-        <w:rPr>
-          <w:rFonts w:cs="Calibri" w:ascii="Calibri" w:hAnsi="Calibri"/>
-          <w:lang w:val="en-CA"/>
-        </w:rPr>
-        <w:t xml:space="preserve">. </w:t>
-      </w:r>
-      <w:r>
-        <w:rPr>
-          <w:rFonts w:cs="Calibri" w:ascii="Calibri" w:hAnsi="Calibri"/>
-          <w:lang w:val="en-CA"/>
-        </w:rPr>
-        <w:t>Health completely recovered after day surgery and two years of university.</w:t>
-      </w:r>
-    </w:p>
-    <w:p>
-      <w:pPr>
         <w:pStyle w:val="Heading1"/>
         <w:rPr>
           <w:rFonts w:ascii="Calibri" w:hAnsi="Calibri" w:cs="Calibri"/>
@@ -1374,6 +1331,41 @@
     <w:p>
       <w:pPr>
         <w:pStyle w:val="ListParagraph"/>
+        <w:widowControl/>
+        <w:ind w:left="0" w:right="0" w:hanging="0"/>
+        <w:rPr>
+          <w:rFonts w:ascii="Calibri" w:hAnsi="Calibri" w:cs="Calibri"/>
+          <w:b w:val="false"/>
+          <w:i w:val="false"/>
+          <w:caps w:val="false"/>
+          <w:smallCaps w:val="false"/>
+          <w:color w:val="232323"/>
+          <w:spacing w:val="0"/>
+          <w:sz w:val="22"/>
+          <w:szCs w:val="22"/>
+          <w:u w:val="none"/>
+          <w:lang w:val="en-CA"/>
+        </w:rPr>
+      </w:pPr>
+      <w:r>
+        <w:rPr>
+          <w:rFonts w:cs="Calibri" w:ascii="Calibri" w:hAnsi="Calibri"/>
+          <w:b w:val="false"/>
+          <w:i w:val="false"/>
+          <w:caps w:val="false"/>
+          <w:smallCaps w:val="false"/>
+          <w:color w:val="232323"/>
+          <w:spacing w:val="0"/>
+          <w:sz w:val="22"/>
+          <w:szCs w:val="22"/>
+          <w:u w:val="none"/>
+          <w:lang w:val="en-CA"/>
+        </w:rPr>
+      </w:r>
+    </w:p>
+    <w:p>
+      <w:pPr>
+        <w:pStyle w:val="ListParagraph"/>
         <w:rPr/>
       </w:pPr>
       <w:r>
@@ -1494,7 +1486,35 @@
           <w:rFonts w:cs="Calibri" w:ascii="Calibri" w:hAnsi="Calibri"/>
           <w:lang w:val="en-CA"/>
         </w:rPr>
-        <w:t>During COVID-19 pandemic, regularly wear a face shield and mask at work since I have asthma (from childhood). Protects myself and the others around me.</w:t>
+        <w:t>During COVID-19 pandemic, regularly wear a face shield and/</w:t>
+      </w:r>
+      <w:r>
+        <w:rPr>
+          <w:rFonts w:cs="Calibri" w:ascii="Calibri" w:hAnsi="Calibri"/>
+          <w:lang w:val="en-CA"/>
+        </w:rPr>
+        <w:t>or</w:t>
+      </w:r>
+      <w:r>
+        <w:rPr>
+          <w:rFonts w:cs="Calibri" w:ascii="Calibri" w:hAnsi="Calibri"/>
+          <w:lang w:val="en-CA"/>
+        </w:rPr>
+        <w:t xml:space="preserve"> mask at work. </w:t>
+      </w:r>
+      <w:r>
+        <w:rPr>
+          <w:rFonts w:cs="Calibri" w:ascii="Calibri" w:hAnsi="Calibri"/>
+          <w:lang w:val="en-CA"/>
+        </w:rPr>
+        <w:t>Enforce Ottawa mask wearing bylaw at work, asking customers to wear a mask; covering nose and mouth.</w:t>
+      </w:r>
+      <w:r>
+        <w:rPr>
+          <w:rFonts w:cs="Calibri" w:ascii="Calibri" w:hAnsi="Calibri"/>
+          <w:lang w:val="en-CA"/>
+        </w:rPr>
+        <w:t xml:space="preserve"> Protects myself and the others around me.</w:t>
       </w:r>
     </w:p>
     <w:p>
@@ -1963,6 +1983,36 @@
           <w:lang w:val="en-CA"/>
         </w:rPr>
         <w:t>Provided support during polling hours and while votes were being tabulated.</w:t>
+      </w:r>
+    </w:p>
+    <w:p>
+      <w:pPr>
+        <w:pStyle w:val="ListParagraph"/>
+        <w:rPr>
+          <w:rFonts w:ascii="Calibri" w:hAnsi="Calibri" w:cs="Calibri"/>
+          <w:lang w:val="en-CA"/>
+        </w:rPr>
+      </w:pPr>
+      <w:r>
+        <w:rPr>
+          <w:rFonts w:cs="Calibri" w:ascii="Calibri" w:hAnsi="Calibri"/>
+          <w:lang w:val="en-CA"/>
+        </w:rPr>
+      </w:r>
+    </w:p>
+    <w:p>
+      <w:pPr>
+        <w:pStyle w:val="ListParagraph"/>
+        <w:rPr>
+          <w:rFonts w:ascii="Calibri" w:hAnsi="Calibri" w:cs="Calibri"/>
+          <w:lang w:val="en-CA"/>
+        </w:rPr>
+      </w:pPr>
+      <w:r>
+        <w:rPr>
+          <w:rFonts w:cs="Calibri" w:ascii="Calibri" w:hAnsi="Calibri"/>
+          <w:lang w:val="en-CA"/>
+        </w:rPr>
       </w:r>
     </w:p>
     <w:p>
@@ -2683,370 +2733,6 @@
           <w:lang w:eastAsia="en-CA"/>
         </w:rPr>
         <w:t>Troubleshooted mobile related customer issues. Educated clients on usage and features of their new mobile devices.</w:t>
-      </w:r>
-    </w:p>
-    <w:p>
-      <w:pPr>
-        <w:pStyle w:val="Heading1"/>
-        <w:tabs>
-          <w:tab w:val="clear" w:pos="9360"/>
-          <w:tab w:val="left" w:pos="-40" w:leader="none"/>
-          <w:tab w:val="left" w:pos="284" w:leader="none"/>
-        </w:tabs>
-        <w:spacing w:before="0" w:after="0"/>
-        <w:textAlignment w:val="baseline"/>
-        <w:rPr>
-          <w:rFonts w:ascii="Calibri" w:hAnsi="Calibri" w:eastAsia="Times New Roman" w:cs="Calibri"/>
-          <w:b/>
-          <w:b/>
-          <w:bCs/>
-          <w:i w:val="false"/>
-          <w:i w:val="false"/>
-          <w:iCs w:val="false"/>
-          <w:caps/>
-          <w:color w:val="000000"/>
-          <w:spacing w:val="25"/>
-          <w:kern w:val="0"/>
-          <w:sz w:val="22"/>
-          <w:szCs w:val="22"/>
-          <w:lang w:val="en-CA" w:eastAsia="en-CA"/>
-        </w:rPr>
-      </w:pPr>
-      <w:r>
-        <w:rPr>
-          <w:rFonts w:eastAsia="Times New Roman" w:cs="Calibri" w:ascii="Calibri" w:hAnsi="Calibri"/>
-          <w:b/>
-          <w:bCs/>
-          <w:i w:val="false"/>
-          <w:iCs w:val="false"/>
-          <w:caps/>
-          <w:color w:val="000000"/>
-          <w:spacing w:val="25"/>
-          <w:kern w:val="0"/>
-          <w:sz w:val="22"/>
-          <w:szCs w:val="22"/>
-          <w:lang w:val="en-CA" w:eastAsia="en-CA"/>
-        </w:rPr>
-      </w:r>
-    </w:p>
-    <w:p>
-      <w:pPr>
-        <w:pStyle w:val="Heading1"/>
-        <w:tabs>
-          <w:tab w:val="clear" w:pos="9360"/>
-          <w:tab w:val="left" w:pos="-40" w:leader="none"/>
-          <w:tab w:val="left" w:pos="284" w:leader="none"/>
-        </w:tabs>
-        <w:spacing w:before="0" w:after="0"/>
-        <w:textAlignment w:val="baseline"/>
-        <w:rPr>
-          <w:rFonts w:ascii="Calibri" w:hAnsi="Calibri" w:eastAsia="Times New Roman" w:cs="Calibri"/>
-          <w:b/>
-          <w:b/>
-          <w:bCs/>
-          <w:i w:val="false"/>
-          <w:i w:val="false"/>
-          <w:iCs w:val="false"/>
-          <w:caps/>
-          <w:color w:val="000000"/>
-          <w:spacing w:val="25"/>
-          <w:kern w:val="0"/>
-          <w:sz w:val="22"/>
-          <w:szCs w:val="22"/>
-          <w:lang w:val="en-CA" w:eastAsia="en-CA"/>
-        </w:rPr>
-      </w:pPr>
-      <w:r>
-        <w:rPr>
-          <w:rFonts w:eastAsia="Times New Roman" w:cs="Calibri" w:ascii="Calibri" w:hAnsi="Calibri"/>
-          <w:b/>
-          <w:bCs/>
-          <w:i w:val="false"/>
-          <w:iCs w:val="false"/>
-          <w:caps/>
-          <w:color w:val="000000"/>
-          <w:spacing w:val="25"/>
-          <w:kern w:val="0"/>
-          <w:sz w:val="22"/>
-          <w:szCs w:val="22"/>
-          <w:lang w:val="en-CA" w:eastAsia="en-CA"/>
-        </w:rPr>
-        <w:t>Activities</w:t>
-      </w:r>
-    </w:p>
-    <w:p>
-      <w:pPr>
-        <w:pStyle w:val="Normal"/>
-        <w:tabs>
-          <w:tab w:val="clear" w:pos="9360"/>
-          <w:tab w:val="left" w:pos="-40" w:leader="none"/>
-          <w:tab w:val="left" w:pos="284" w:leader="none"/>
-        </w:tabs>
-        <w:spacing w:before="0" w:after="0"/>
-        <w:textAlignment w:val="baseline"/>
-        <w:rPr/>
-      </w:pPr>
-      <w:r>
-        <w:rPr>
-          <w:rFonts w:eastAsia="Times New Roman" w:cs="Calibri" w:ascii="Calibri" w:hAnsi="Calibri"/>
-          <w:b w:val="false"/>
-          <w:bCs w:val="false"/>
-          <w:i w:val="false"/>
-          <w:iCs w:val="false"/>
-          <w:kern w:val="0"/>
-          <w:lang w:eastAsia="en-CA"/>
-        </w:rPr>
-        <w:t xml:space="preserve">Recreational tennis </w:t>
-      </w:r>
-      <w:r>
-        <w:rPr>
-          <w:rFonts w:eastAsia="Times New Roman" w:cs="Calibri" w:ascii="Calibri" w:hAnsi="Calibri"/>
-          <w:b w:val="false"/>
-          <w:bCs w:val="false"/>
-          <w:i w:val="false"/>
-          <w:iCs w:val="false"/>
-          <w:kern w:val="0"/>
-          <w:lang w:eastAsia="en-CA"/>
-        </w:rPr>
-        <w:t xml:space="preserve">and </w:t>
-      </w:r>
-      <w:r>
-        <w:rPr>
-          <w:rFonts w:eastAsia="Times New Roman" w:cs="Calibri" w:ascii="Calibri" w:hAnsi="Calibri"/>
-          <w:b w:val="false"/>
-          <w:bCs w:val="false"/>
-          <w:i w:val="false"/>
-          <w:iCs w:val="false"/>
-          <w:kern w:val="0"/>
-          <w:lang w:eastAsia="en-CA"/>
-        </w:rPr>
-        <w:t xml:space="preserve">jogging. </w:t>
-      </w:r>
-      <w:r>
-        <w:rPr>
-          <w:rFonts w:eastAsia="Times New Roman" w:cs="Calibri" w:ascii="Calibri" w:hAnsi="Calibri"/>
-          <w:b w:val="false"/>
-          <w:bCs w:val="false"/>
-          <w:i w:val="false"/>
-          <w:iCs w:val="false"/>
-          <w:kern w:val="0"/>
-          <w:lang w:eastAsia="en-CA"/>
-        </w:rPr>
-        <w:t>Currently c</w:t>
-      </w:r>
-      <w:r>
-        <w:rPr>
-          <w:rFonts w:eastAsia="Times New Roman" w:cs="Calibri" w:ascii="Calibri" w:hAnsi="Calibri"/>
-          <w:b w:val="false"/>
-          <w:bCs w:val="false"/>
-          <w:i w:val="false"/>
-          <w:iCs w:val="false"/>
-          <w:kern w:val="0"/>
-          <w:lang w:eastAsia="en-CA"/>
-        </w:rPr>
-        <w:t xml:space="preserve">ycle as a means of transportation. </w:t>
-      </w:r>
-      <w:r>
-        <w:rPr>
-          <w:rFonts w:eastAsia="Times New Roman" w:cs="Calibri" w:ascii="Calibri" w:hAnsi="Calibri"/>
-          <w:b w:val="false"/>
-          <w:bCs w:val="false"/>
-          <w:i w:val="false"/>
-          <w:iCs w:val="false"/>
-          <w:kern w:val="0"/>
-          <w:lang w:eastAsia="en-CA"/>
-        </w:rPr>
-        <w:t xml:space="preserve">Working on G drivers license. </w:t>
-      </w:r>
-      <w:r>
-        <w:rPr>
-          <w:rFonts w:eastAsia="Times New Roman" w:cs="Calibri" w:ascii="Calibri" w:hAnsi="Calibri"/>
-          <w:b w:val="false"/>
-          <w:bCs w:val="false"/>
-          <w:i w:val="false"/>
-          <w:iCs w:val="false"/>
-          <w:kern w:val="0"/>
-          <w:lang w:eastAsia="en-CA"/>
-        </w:rPr>
-        <w:t xml:space="preserve"> Play</w:t>
-      </w:r>
-      <w:r>
-        <w:rPr>
-          <w:rFonts w:eastAsia="Times New Roman" w:cs="Calibri" w:ascii="Calibri" w:hAnsi="Calibri"/>
-          <w:b w:val="false"/>
-          <w:bCs w:val="false"/>
-          <w:i w:val="false"/>
-          <w:iCs w:val="false"/>
-          <w:kern w:val="0"/>
-          <w:lang w:eastAsia="en-CA"/>
-        </w:rPr>
-        <w:t>s</w:t>
-      </w:r>
-      <w:r>
-        <w:rPr>
-          <w:rFonts w:eastAsia="Times New Roman" w:cs="Calibri" w:ascii="Calibri" w:hAnsi="Calibri"/>
-          <w:b w:val="false"/>
-          <w:bCs w:val="false"/>
-          <w:i w:val="false"/>
-          <w:iCs w:val="false"/>
-          <w:kern w:val="0"/>
-          <w:lang w:eastAsia="en-CA"/>
-        </w:rPr>
-        <w:t xml:space="preserve"> guitar </w:t>
-      </w:r>
-      <w:r>
-        <w:rPr>
-          <w:rFonts w:eastAsia="Times New Roman" w:cs="Calibri" w:ascii="Calibri" w:hAnsi="Calibri"/>
-          <w:b w:val="false"/>
-          <w:bCs w:val="false"/>
-          <w:i w:val="false"/>
-          <w:iCs w:val="false"/>
-          <w:kern w:val="0"/>
-          <w:lang w:eastAsia="en-CA"/>
-        </w:rPr>
-        <w:t>including tabs, notation and Rocksmith. Enjoy watching sci-fi with friends</w:t>
-      </w:r>
-      <w:r>
-        <w:rPr>
-          <w:rFonts w:eastAsia="Times New Roman" w:cs="Calibri" w:ascii="Calibri" w:hAnsi="Calibri"/>
-          <w:b w:val="false"/>
-          <w:bCs w:val="false"/>
-          <w:i w:val="false"/>
-          <w:iCs w:val="false"/>
-          <w:kern w:val="0"/>
-          <w:lang w:eastAsia="en-CA"/>
-        </w:rPr>
-        <w:t xml:space="preserve">. </w:t>
-      </w:r>
-      <w:r>
-        <w:rPr>
-          <w:rStyle w:val="NormalItalic"/>
-          <w:rFonts w:eastAsia="Times New Roman" w:cs="Calibri" w:ascii="Calibri" w:hAnsi="Calibri"/>
-          <w:b w:val="false"/>
-          <w:bCs w:val="false"/>
-          <w:i w:val="false"/>
-          <w:iCs w:val="false"/>
-          <w:kern w:val="0"/>
-          <w:lang w:val="en-CA" w:eastAsia="en-CA"/>
-        </w:rPr>
-        <w:t>Early March</w:t>
-      </w:r>
-      <w:r>
-        <w:rPr>
-          <w:rStyle w:val="NormalItalic"/>
-          <w:rFonts w:eastAsia="Times New Roman" w:cs="Calibri" w:ascii="Calibri" w:hAnsi="Calibri"/>
-          <w:b w:val="false"/>
-          <w:bCs w:val="false"/>
-          <w:i w:val="false"/>
-          <w:iCs w:val="false"/>
-          <w:kern w:val="0"/>
-          <w:lang w:val="en-CA" w:eastAsia="en-CA"/>
-        </w:rPr>
-        <w:t xml:space="preserve">, </w:t>
-      </w:r>
-      <w:r>
-        <w:rPr>
-          <w:rStyle w:val="NormalItalic"/>
-          <w:rFonts w:eastAsia="Times New Roman" w:cs="Calibri" w:ascii="Calibri" w:hAnsi="Calibri"/>
-          <w:b w:val="false"/>
-          <w:bCs w:val="false"/>
-          <w:i w:val="false"/>
-          <w:iCs w:val="false"/>
-          <w:kern w:val="0"/>
-          <w:lang w:val="en-CA" w:eastAsia="en-CA"/>
-        </w:rPr>
-        <w:t>went to</w:t>
-      </w:r>
-      <w:r>
-        <w:rPr>
-          <w:rStyle w:val="NormalItalic"/>
-          <w:rFonts w:eastAsia="Times New Roman" w:cs="Calibri" w:ascii="Calibri" w:hAnsi="Calibri"/>
-          <w:b w:val="false"/>
-          <w:bCs w:val="false"/>
-          <w:i w:val="false"/>
-          <w:iCs w:val="false"/>
-          <w:kern w:val="0"/>
-          <w:lang w:val="en-CA" w:eastAsia="en-CA"/>
-        </w:rPr>
-        <w:t xml:space="preserve"> </w:t>
-      </w:r>
-      <w:r>
-        <w:rPr>
-          <w:rStyle w:val="NormalItalic"/>
-          <w:rFonts w:eastAsia="Times New Roman" w:cs="Calibri" w:ascii="Calibri" w:hAnsi="Calibri"/>
-          <w:b w:val="false"/>
-          <w:bCs w:val="false"/>
-          <w:i w:val="false"/>
-          <w:iCs w:val="false"/>
-          <w:kern w:val="0"/>
-          <w:lang w:val="en-CA" w:eastAsia="en-CA"/>
-        </w:rPr>
-        <w:t xml:space="preserve">sister </w:t>
-      </w:r>
-      <w:r>
-        <w:rPr>
-          <w:rStyle w:val="NormalItalic"/>
-          <w:rFonts w:eastAsia="Times New Roman" w:cs="Calibri" w:ascii="Calibri" w:hAnsi="Calibri"/>
-          <w:b w:val="false"/>
-          <w:bCs w:val="false"/>
-          <w:i w:val="false"/>
-          <w:iCs w:val="false"/>
-          <w:kern w:val="0"/>
-          <w:lang w:val="en-CA" w:eastAsia="en-CA"/>
-        </w:rPr>
-        <w:t>and Ken</w:t>
-      </w:r>
-      <w:r>
-        <w:rPr>
-          <w:rStyle w:val="NormalItalic"/>
-          <w:rFonts w:eastAsia="Times New Roman" w:cs="Calibri" w:ascii="Calibri" w:hAnsi="Calibri"/>
-          <w:b w:val="false"/>
-          <w:bCs w:val="false"/>
-          <w:i w:val="false"/>
-          <w:iCs w:val="false"/>
-          <w:kern w:val="0"/>
-          <w:lang w:val="en-CA" w:eastAsia="en-CA"/>
-        </w:rPr>
-        <w:t>’s wedding and vacat</w:t>
-      </w:r>
-      <w:r>
-        <w:rPr>
-          <w:rStyle w:val="NormalItalic"/>
-          <w:rFonts w:eastAsia="Times New Roman" w:cs="Calibri" w:ascii="Calibri" w:hAnsi="Calibri"/>
-          <w:b w:val="false"/>
-          <w:bCs w:val="false"/>
-          <w:i w:val="false"/>
-          <w:iCs w:val="false"/>
-          <w:kern w:val="0"/>
-          <w:lang w:val="en-CA" w:eastAsia="en-CA"/>
-        </w:rPr>
-        <w:t>ioned</w:t>
-      </w:r>
-      <w:r>
-        <w:rPr>
-          <w:rStyle w:val="NormalItalic"/>
-          <w:rFonts w:eastAsia="Times New Roman" w:cs="Calibri" w:ascii="Calibri" w:hAnsi="Calibri"/>
-          <w:b w:val="false"/>
-          <w:bCs w:val="false"/>
-          <w:i w:val="false"/>
-          <w:iCs w:val="false"/>
-          <w:kern w:val="0"/>
-          <w:lang w:val="en-CA" w:eastAsia="en-CA"/>
-        </w:rPr>
-        <w:t xml:space="preserve"> with friends in </w:t>
-      </w:r>
-      <w:r>
-        <w:rPr>
-          <w:rStyle w:val="NormalItalic"/>
-          <w:rFonts w:eastAsia="Times New Roman" w:cs="Calibri" w:ascii="Calibri" w:hAnsi="Calibri"/>
-          <w:b w:val="false"/>
-          <w:bCs w:val="false"/>
-          <w:i w:val="false"/>
-          <w:iCs w:val="false"/>
-          <w:kern w:val="0"/>
-          <w:lang w:val="en-CA" w:eastAsia="en-CA"/>
-        </w:rPr>
-        <w:t>Florida.</w:t>
       </w:r>
     </w:p>
     <w:sectPr>
@@ -3165,6 +2851,9 @@
       <w:lvlText w:val=""/>
       <w:lvlJc w:val="left"/>
       <w:pPr>
+        <w:tabs>
+          <w:tab w:val="num" w:pos="0"/>
+        </w:tabs>
         <w:ind w:left="0" w:hanging="0"/>
       </w:pPr>
     </w:lvl>
@@ -3175,6 +2864,9 @@
       <w:lvlText w:val=""/>
       <w:lvlJc w:val="left"/>
       <w:pPr>
+        <w:tabs>
+          <w:tab w:val="num" w:pos="0"/>
+        </w:tabs>
         <w:ind w:left="0" w:hanging="0"/>
       </w:pPr>
     </w:lvl>
@@ -3185,6 +2877,9 @@
       <w:lvlText w:val=""/>
       <w:lvlJc w:val="left"/>
       <w:pPr>
+        <w:tabs>
+          <w:tab w:val="num" w:pos="0"/>
+        </w:tabs>
         <w:ind w:left="0" w:hanging="0"/>
       </w:pPr>
     </w:lvl>
@@ -3195,6 +2890,9 @@
       <w:lvlText w:val=""/>
       <w:lvlJc w:val="left"/>
       <w:pPr>
+        <w:tabs>
+          <w:tab w:val="num" w:pos="0"/>
+        </w:tabs>
         <w:ind w:left="0" w:hanging="0"/>
       </w:pPr>
     </w:lvl>
@@ -3205,6 +2903,9 @@
       <w:lvlText w:val=""/>
       <w:lvlJc w:val="left"/>
       <w:pPr>
+        <w:tabs>
+          <w:tab w:val="num" w:pos="0"/>
+        </w:tabs>
         <w:ind w:left="0" w:hanging="0"/>
       </w:pPr>
     </w:lvl>
@@ -3215,6 +2916,9 @@
       <w:lvlText w:val=""/>
       <w:lvlJc w:val="left"/>
       <w:pPr>
+        <w:tabs>
+          <w:tab w:val="num" w:pos="0"/>
+        </w:tabs>
         <w:ind w:left="0" w:hanging="0"/>
       </w:pPr>
     </w:lvl>
@@ -3225,6 +2929,9 @@
       <w:lvlText w:val=""/>
       <w:lvlJc w:val="left"/>
       <w:pPr>
+        <w:tabs>
+          <w:tab w:val="num" w:pos="0"/>
+        </w:tabs>
         <w:ind w:left="0" w:hanging="0"/>
       </w:pPr>
     </w:lvl>
@@ -3235,6 +2942,9 @@
       <w:lvlText w:val=""/>
       <w:lvlJc w:val="left"/>
       <w:pPr>
+        <w:tabs>
+          <w:tab w:val="num" w:pos="0"/>
+        </w:tabs>
         <w:ind w:left="0" w:hanging="0"/>
       </w:pPr>
     </w:lvl>
@@ -3245,6 +2955,9 @@
       <w:lvlText w:val=""/>
       <w:lvlJc w:val="left"/>
       <w:pPr>
+        <w:tabs>
+          <w:tab w:val="num" w:pos="0"/>
+        </w:tabs>
         <w:ind w:left="0" w:hanging="0"/>
       </w:pPr>
     </w:lvl>
@@ -3263,7 +2976,6 @@
       </w:pPr>
       <w:rPr>
         <w:rFonts w:ascii="Symbol" w:hAnsi="Symbol" w:cs="Symbol" w:hint="default"/>
-        <w:rFonts w:cs="Symbol"/>
       </w:rPr>
     </w:lvl>
     <w:lvl w:ilvl="1">
@@ -3279,7 +2991,6 @@
       </w:pPr>
       <w:rPr>
         <w:rFonts w:ascii="Symbol" w:hAnsi="Symbol" w:cs="Symbol" w:hint="default"/>
-        <w:rFonts w:cs="Symbol"/>
       </w:rPr>
     </w:lvl>
     <w:lvl w:ilvl="2">
@@ -3295,7 +3006,6 @@
       </w:pPr>
       <w:rPr>
         <w:rFonts w:ascii="Symbol" w:hAnsi="Symbol" w:cs="Symbol" w:hint="default"/>
-        <w:rFonts w:cs="Symbol"/>
       </w:rPr>
     </w:lvl>
     <w:lvl w:ilvl="3">
@@ -3311,7 +3021,6 @@
       </w:pPr>
       <w:rPr>
         <w:rFonts w:ascii="Symbol" w:hAnsi="Symbol" w:cs="Symbol" w:hint="default"/>
-        <w:rFonts w:cs="Symbol"/>
       </w:rPr>
     </w:lvl>
     <w:lvl w:ilvl="4">
@@ -3327,7 +3036,6 @@
       </w:pPr>
       <w:rPr>
         <w:rFonts w:ascii="Symbol" w:hAnsi="Symbol" w:cs="Symbol" w:hint="default"/>
-        <w:rFonts w:cs="Symbol"/>
       </w:rPr>
     </w:lvl>
     <w:lvl w:ilvl="5">
@@ -3343,7 +3051,6 @@
       </w:pPr>
       <w:rPr>
         <w:rFonts w:ascii="Symbol" w:hAnsi="Symbol" w:cs="Symbol" w:hint="default"/>
-        <w:rFonts w:cs="Symbol"/>
       </w:rPr>
     </w:lvl>
     <w:lvl w:ilvl="6">
@@ -3359,7 +3066,6 @@
       </w:pPr>
       <w:rPr>
         <w:rFonts w:ascii="Symbol" w:hAnsi="Symbol" w:cs="Symbol" w:hint="default"/>
-        <w:rFonts w:cs="Symbol"/>
       </w:rPr>
     </w:lvl>
     <w:lvl w:ilvl="7">
@@ -3375,7 +3081,6 @@
       </w:pPr>
       <w:rPr>
         <w:rFonts w:ascii="Symbol" w:hAnsi="Symbol" w:cs="Symbol" w:hint="default"/>
-        <w:rFonts w:cs="Symbol"/>
       </w:rPr>
     </w:lvl>
     <w:lvl w:ilvl="8">
@@ -3391,7 +3096,6 @@
       </w:pPr>
       <w:rPr>
         <w:rFonts w:ascii="Symbol" w:hAnsi="Symbol" w:cs="Symbol" w:hint="default"/>
-        <w:rFonts w:cs="Symbol"/>
       </w:rPr>
     </w:lvl>
   </w:abstractNum>
@@ -3409,7 +3113,6 @@
       </w:pPr>
       <w:rPr>
         <w:rFonts w:ascii="Symbol" w:hAnsi="Symbol" w:cs="Symbol" w:hint="default"/>
-        <w:rFonts w:cs="OpenSymbol"/>
       </w:rPr>
     </w:lvl>
     <w:lvl w:ilvl="1">
@@ -3425,7 +3128,6 @@
       </w:pPr>
       <w:rPr>
         <w:rFonts w:ascii="OpenSymbol" w:hAnsi="OpenSymbol" w:cs="OpenSymbol" w:hint="default"/>
-        <w:rFonts w:cs="OpenSymbol"/>
       </w:rPr>
     </w:lvl>
     <w:lvl w:ilvl="2">
@@ -3441,7 +3143,6 @@
       </w:pPr>
       <w:rPr>
         <w:rFonts w:ascii="OpenSymbol" w:hAnsi="OpenSymbol" w:cs="OpenSymbol" w:hint="default"/>
-        <w:rFonts w:cs="OpenSymbol"/>
       </w:rPr>
     </w:lvl>
     <w:lvl w:ilvl="3">
@@ -3457,7 +3158,6 @@
       </w:pPr>
       <w:rPr>
         <w:rFonts w:ascii="Symbol" w:hAnsi="Symbol" w:cs="Symbol" w:hint="default"/>
-        <w:rFonts w:cs="OpenSymbol"/>
       </w:rPr>
     </w:lvl>
     <w:lvl w:ilvl="4">
@@ -3473,7 +3173,6 @@
       </w:pPr>
       <w:rPr>
         <w:rFonts w:ascii="OpenSymbol" w:hAnsi="OpenSymbol" w:cs="OpenSymbol" w:hint="default"/>
-        <w:rFonts w:cs="OpenSymbol"/>
       </w:rPr>
     </w:lvl>
     <w:lvl w:ilvl="5">
@@ -3489,7 +3188,6 @@
       </w:pPr>
       <w:rPr>
         <w:rFonts w:ascii="OpenSymbol" w:hAnsi="OpenSymbol" w:cs="OpenSymbol" w:hint="default"/>
-        <w:rFonts w:cs="OpenSymbol"/>
       </w:rPr>
     </w:lvl>
     <w:lvl w:ilvl="6">
@@ -3505,7 +3203,6 @@
       </w:pPr>
       <w:rPr>
         <w:rFonts w:ascii="Symbol" w:hAnsi="Symbol" w:cs="Symbol" w:hint="default"/>
-        <w:rFonts w:cs="OpenSymbol"/>
       </w:rPr>
     </w:lvl>
     <w:lvl w:ilvl="7">
@@ -3521,7 +3218,6 @@
       </w:pPr>
       <w:rPr>
         <w:rFonts w:ascii="OpenSymbol" w:hAnsi="OpenSymbol" w:cs="OpenSymbol" w:hint="default"/>
-        <w:rFonts w:cs="OpenSymbol"/>
       </w:rPr>
     </w:lvl>
     <w:lvl w:ilvl="8">
@@ -3537,7 +3233,6 @@
       </w:pPr>
       <w:rPr>
         <w:rFonts w:ascii="OpenSymbol" w:hAnsi="OpenSymbol" w:cs="OpenSymbol" w:hint="default"/>
-        <w:rFonts w:cs="OpenSymbol"/>
       </w:rPr>
     </w:lvl>
   </w:abstractNum>
@@ -3555,7 +3250,6 @@
       </w:pPr>
       <w:rPr>
         <w:rFonts w:ascii="Symbol" w:hAnsi="Symbol" w:cs="Symbol" w:hint="default"/>
-        <w:rFonts w:cs="OpenSymbol"/>
       </w:rPr>
     </w:lvl>
     <w:lvl w:ilvl="1">
@@ -3571,7 +3265,6 @@
       </w:pPr>
       <w:rPr>
         <w:rFonts w:ascii="OpenSymbol" w:hAnsi="OpenSymbol" w:cs="OpenSymbol" w:hint="default"/>
-        <w:rFonts w:cs="OpenSymbol"/>
       </w:rPr>
     </w:lvl>
     <w:lvl w:ilvl="2">
@@ -3587,7 +3280,6 @@
       </w:pPr>
       <w:rPr>
         <w:rFonts w:ascii="OpenSymbol" w:hAnsi="OpenSymbol" w:cs="OpenSymbol" w:hint="default"/>
-        <w:rFonts w:cs="OpenSymbol"/>
       </w:rPr>
     </w:lvl>
     <w:lvl w:ilvl="3">
@@ -3603,7 +3295,6 @@
       </w:pPr>
       <w:rPr>
         <w:rFonts w:ascii="Symbol" w:hAnsi="Symbol" w:cs="Symbol" w:hint="default"/>
-        <w:rFonts w:cs="OpenSymbol"/>
       </w:rPr>
     </w:lvl>
     <w:lvl w:ilvl="4">
@@ -3619,7 +3310,6 @@
       </w:pPr>
       <w:rPr>
         <w:rFonts w:ascii="OpenSymbol" w:hAnsi="OpenSymbol" w:cs="OpenSymbol" w:hint="default"/>
-        <w:rFonts w:cs="OpenSymbol"/>
       </w:rPr>
     </w:lvl>
     <w:lvl w:ilvl="5">
@@ -3635,7 +3325,6 @@
       </w:pPr>
       <w:rPr>
         <w:rFonts w:ascii="OpenSymbol" w:hAnsi="OpenSymbol" w:cs="OpenSymbol" w:hint="default"/>
-        <w:rFonts w:cs="OpenSymbol"/>
       </w:rPr>
     </w:lvl>
     <w:lvl w:ilvl="6">
@@ -3651,7 +3340,6 @@
       </w:pPr>
       <w:rPr>
         <w:rFonts w:ascii="Symbol" w:hAnsi="Symbol" w:cs="Symbol" w:hint="default"/>
-        <w:rFonts w:cs="OpenSymbol"/>
       </w:rPr>
     </w:lvl>
     <w:lvl w:ilvl="7">
@@ -3667,7 +3355,6 @@
       </w:pPr>
       <w:rPr>
         <w:rFonts w:ascii="OpenSymbol" w:hAnsi="OpenSymbol" w:cs="OpenSymbol" w:hint="default"/>
-        <w:rFonts w:cs="OpenSymbol"/>
       </w:rPr>
     </w:lvl>
     <w:lvl w:ilvl="8">
@@ -3683,7 +3370,6 @@
       </w:pPr>
       <w:rPr>
         <w:rFonts w:ascii="OpenSymbol" w:hAnsi="OpenSymbol" w:cs="OpenSymbol" w:hint="default"/>
-        <w:rFonts w:cs="OpenSymbol"/>
       </w:rPr>
     </w:lvl>
   </w:abstractNum>
@@ -3701,7 +3387,6 @@
       </w:pPr>
       <w:rPr>
         <w:rFonts w:ascii="Symbol" w:hAnsi="Symbol" w:cs="Symbol" w:hint="default"/>
-        <w:rFonts w:cs="OpenSymbol"/>
       </w:rPr>
     </w:lvl>
     <w:lvl w:ilvl="1">
@@ -3717,7 +3402,6 @@
       </w:pPr>
       <w:rPr>
         <w:rFonts w:ascii="OpenSymbol" w:hAnsi="OpenSymbol" w:cs="OpenSymbol" w:hint="default"/>
-        <w:rFonts w:cs="OpenSymbol"/>
       </w:rPr>
     </w:lvl>
     <w:lvl w:ilvl="2">
@@ -3733,7 +3417,6 @@
       </w:pPr>
       <w:rPr>
         <w:rFonts w:ascii="OpenSymbol" w:hAnsi="OpenSymbol" w:cs="OpenSymbol" w:hint="default"/>
-        <w:rFonts w:cs="OpenSymbol"/>
       </w:rPr>
     </w:lvl>
     <w:lvl w:ilvl="3">
@@ -3749,7 +3432,6 @@
       </w:pPr>
       <w:rPr>
         <w:rFonts w:ascii="Symbol" w:hAnsi="Symbol" w:cs="Symbol" w:hint="default"/>
-        <w:rFonts w:cs="OpenSymbol"/>
       </w:rPr>
     </w:lvl>
     <w:lvl w:ilvl="4">
@@ -3765,7 +3447,6 @@
       </w:pPr>
       <w:rPr>
         <w:rFonts w:ascii="OpenSymbol" w:hAnsi="OpenSymbol" w:cs="OpenSymbol" w:hint="default"/>
-        <w:rFonts w:cs="OpenSymbol"/>
       </w:rPr>
     </w:lvl>
     <w:lvl w:ilvl="5">
@@ -3781,7 +3462,6 @@
       </w:pPr>
       <w:rPr>
         <w:rFonts w:ascii="OpenSymbol" w:hAnsi="OpenSymbol" w:cs="OpenSymbol" w:hint="default"/>
-        <w:rFonts w:cs="OpenSymbol"/>
       </w:rPr>
     </w:lvl>
     <w:lvl w:ilvl="6">
@@ -3797,7 +3477,6 @@
       </w:pPr>
       <w:rPr>
         <w:rFonts w:ascii="Symbol" w:hAnsi="Symbol" w:cs="Symbol" w:hint="default"/>
-        <w:rFonts w:cs="OpenSymbol"/>
       </w:rPr>
     </w:lvl>
     <w:lvl w:ilvl="7">
@@ -3813,7 +3492,6 @@
       </w:pPr>
       <w:rPr>
         <w:rFonts w:ascii="OpenSymbol" w:hAnsi="OpenSymbol" w:cs="OpenSymbol" w:hint="default"/>
-        <w:rFonts w:cs="OpenSymbol"/>
       </w:rPr>
     </w:lvl>
     <w:lvl w:ilvl="8">
@@ -3829,7 +3507,6 @@
       </w:pPr>
       <w:rPr>
         <w:rFonts w:ascii="OpenSymbol" w:hAnsi="OpenSymbol" w:cs="OpenSymbol" w:hint="default"/>
-        <w:rFonts w:cs="OpenSymbol"/>
       </w:rPr>
     </w:lvl>
   </w:abstractNum>
@@ -3840,13 +3517,13 @@
       <w:lvlText w:val=""/>
       <w:lvlJc w:val="left"/>
       <w:pPr>
+        <w:tabs>
+          <w:tab w:val="num" w:pos="0"/>
+        </w:tabs>
         <w:ind w:left="720" w:hanging="360"/>
       </w:pPr>
       <w:rPr>
         <w:rFonts w:ascii="Symbol" w:hAnsi="Symbol" w:cs="Symbol" w:hint="default"/>
-        <w:sz w:val="22"/>
-        <w:b/>
-        <w:rFonts w:cs="Symbol"/>
       </w:rPr>
     </w:lvl>
     <w:lvl w:ilvl="1">
@@ -3855,11 +3532,13 @@
       <w:lvlText w:val="o"/>
       <w:lvlJc w:val="left"/>
       <w:pPr>
+        <w:tabs>
+          <w:tab w:val="num" w:pos="0"/>
+        </w:tabs>
         <w:ind w:left="1440" w:hanging="360"/>
       </w:pPr>
       <w:rPr>
         <w:rFonts w:ascii="Courier New" w:hAnsi="Courier New" w:cs="Courier New" w:hint="default"/>
-        <w:rFonts w:cs="Courier New"/>
       </w:rPr>
     </w:lvl>
     <w:lvl w:ilvl="2">
@@ -3868,11 +3547,13 @@
       <w:lvlText w:val=""/>
       <w:lvlJc w:val="left"/>
       <w:pPr>
+        <w:tabs>
+          <w:tab w:val="num" w:pos="0"/>
+        </w:tabs>
         <w:ind w:left="2160" w:hanging="360"/>
       </w:pPr>
       <w:rPr>
         <w:rFonts w:ascii="Wingdings" w:hAnsi="Wingdings" w:cs="Wingdings" w:hint="default"/>
-        <w:rFonts w:cs="Wingdings"/>
       </w:rPr>
     </w:lvl>
     <w:lvl w:ilvl="3">
@@ -3881,11 +3562,13 @@
       <w:lvlText w:val=""/>
       <w:lvlJc w:val="left"/>
       <w:pPr>
+        <w:tabs>
+          <w:tab w:val="num" w:pos="0"/>
+        </w:tabs>
         <w:ind w:left="2880" w:hanging="360"/>
       </w:pPr>
       <w:rPr>
         <w:rFonts w:ascii="Symbol" w:hAnsi="Symbol" w:cs="Symbol" w:hint="default"/>
-        <w:rFonts w:cs="Symbol"/>
       </w:rPr>
     </w:lvl>
     <w:lvl w:ilvl="4">
@@ -3894,11 +3577,13 @@
       <w:lvlText w:val="o"/>
       <w:lvlJc w:val="left"/>
       <w:pPr>
+        <w:tabs>
+          <w:tab w:val="num" w:pos="0"/>
+        </w:tabs>
         <w:ind w:left="3600" w:hanging="360"/>
       </w:pPr>
       <w:rPr>
         <w:rFonts w:ascii="Courier New" w:hAnsi="Courier New" w:cs="Courier New" w:hint="default"/>
-        <w:rFonts w:cs="Courier New"/>
       </w:rPr>
     </w:lvl>
     <w:lvl w:ilvl="5">
@@ -3907,11 +3592,13 @@
       <w:lvlText w:val=""/>
       <w:lvlJc w:val="left"/>
       <w:pPr>
+        <w:tabs>
+          <w:tab w:val="num" w:pos="0"/>
+        </w:tabs>
         <w:ind w:left="4320" w:hanging="360"/>
       </w:pPr>
       <w:rPr>
         <w:rFonts w:ascii="Wingdings" w:hAnsi="Wingdings" w:cs="Wingdings" w:hint="default"/>
-        <w:rFonts w:cs="Wingdings"/>
       </w:rPr>
     </w:lvl>
     <w:lvl w:ilvl="6">
@@ -3920,11 +3607,13 @@
       <w:lvlText w:val=""/>
       <w:lvlJc w:val="left"/>
       <w:pPr>
+        <w:tabs>
+          <w:tab w:val="num" w:pos="0"/>
+        </w:tabs>
         <w:ind w:left="5040" w:hanging="360"/>
       </w:pPr>
       <w:rPr>
         <w:rFonts w:ascii="Symbol" w:hAnsi="Symbol" w:cs="Symbol" w:hint="default"/>
-        <w:rFonts w:cs="Symbol"/>
       </w:rPr>
     </w:lvl>
     <w:lvl w:ilvl="7">
@@ -3933,11 +3622,13 @@
       <w:lvlText w:val="o"/>
       <w:lvlJc w:val="left"/>
       <w:pPr>
+        <w:tabs>
+          <w:tab w:val="num" w:pos="0"/>
+        </w:tabs>
         <w:ind w:left="5760" w:hanging="360"/>
       </w:pPr>
       <w:rPr>
         <w:rFonts w:ascii="Courier New" w:hAnsi="Courier New" w:cs="Courier New" w:hint="default"/>
-        <w:rFonts w:cs="Courier New"/>
       </w:rPr>
     </w:lvl>
     <w:lvl w:ilvl="8">
@@ -3946,11 +3637,13 @@
       <w:lvlText w:val=""/>
       <w:lvlJc w:val="left"/>
       <w:pPr>
+        <w:tabs>
+          <w:tab w:val="num" w:pos="0"/>
+        </w:tabs>
         <w:ind w:left="6480" w:hanging="360"/>
       </w:pPr>
       <w:rPr>
         <w:rFonts w:ascii="Wingdings" w:hAnsi="Wingdings" w:cs="Wingdings" w:hint="default"/>
-        <w:rFonts w:cs="Wingdings"/>
       </w:rPr>
     </w:lvl>
   </w:abstractNum>

</xml_diff>

<commit_message>
Aunt Audry's recommendations applied
</commit_message>
<xml_diff>
--- a/primaryResume.docx
+++ b/primaryResume.docx
@@ -11,18 +11,49 @@
         </w:tabs>
         <w:spacing w:before="120" w:after="120"/>
         <w:rPr>
-          <w:sz w:val="32"/>
-          <w:szCs w:val="32"/>
-          <w:lang w:val="en-CA"/>
-        </w:rPr>
-      </w:pPr>
-      <w:r>
-        <w:rPr>
-          <w:sz w:val="32"/>
-          <w:szCs w:val="32"/>
+          <w:rFonts w:ascii="Calibri" w:hAnsi="Calibri" w:cs="Calibri"/>
+          <w:sz w:val="36"/>
+          <w:szCs w:val="36"/>
+          <w:lang w:val="en-CA"/>
+        </w:rPr>
+      </w:pPr>
+      <w:r>
+        <w:rPr>
+          <w:rFonts w:cs="Calibri" w:ascii="Calibri" w:hAnsi="Calibri"/>
+          <w:sz w:val="36"/>
+          <w:szCs w:val="36"/>
           <w:lang w:val="en-CA"/>
         </w:rPr>
         <w:t>Sheldon W. B. Maschmeyer</w:t>
+      </w:r>
+    </w:p>
+    <w:p>
+      <w:pPr>
+        <w:pStyle w:val="Name"/>
+        <w:tabs>
+          <w:tab w:val="left" w:pos="2833" w:leader="none"/>
+          <w:tab w:val="right" w:pos="9360" w:leader="none"/>
+        </w:tabs>
+        <w:rPr>
+          <w:rFonts w:ascii="Calibri" w:hAnsi="Calibri" w:cs="Calibri"/>
+          <w:b w:val="false"/>
+          <w:b w:val="false"/>
+          <w:bCs/>
+          <w:sz w:val="24"/>
+          <w:szCs w:val="24"/>
+          <w:lang w:val="en-CA"/>
+        </w:rPr>
+      </w:pPr>
+      <w:r>
+        <w:rPr>
+          <w:rFonts w:cs="Calibri" w:ascii="Calibri" w:hAnsi="Calibri"/>
+          <w:b w:val="false"/>
+          <w:bCs/>
+          <w:sz w:val="24"/>
+          <w:szCs w:val="24"/>
+          <w:lang w:val="en-CA"/>
+        </w:rPr>
+        <w:t>4060 Farrier Court, Mississauga, Ontario</w:t>
       </w:r>
     </w:p>
     <w:tbl>
@@ -51,41 +82,9 @@
           <w:p>
             <w:pPr>
               <w:pStyle w:val="ContactInfo"/>
+              <w:jc w:val="right"/>
               <w:rPr>
-                <w:rFonts w:ascii="ariel" w:hAnsi="ariel"/>
-                <w:sz w:val="18"/>
-                <w:szCs w:val="18"/>
-              </w:rPr>
-            </w:pPr>
-            <w:r>
-              <w:rPr>
-                <w:rFonts w:ascii="arial" w:hAnsi="arial"/>
-                <w:sz w:val="18"/>
-                <w:szCs w:val="18"/>
-              </w:rPr>
-              <w:t>Ottawa</w:t>
-            </w:r>
-            <w:r>
-              <w:rPr>
-                <w:rFonts w:ascii="ariel" w:hAnsi="ariel"/>
-                <w:sz w:val="18"/>
-                <w:szCs w:val="18"/>
-              </w:rPr>
-              <w:t>, Ontario</w:t>
-            </w:r>
-          </w:p>
-        </w:tc>
-        <w:tc>
-          <w:tcPr>
-            <w:tcW w:w="2573" w:type="dxa"/>
-            <w:tcBorders/>
-          </w:tcPr>
-          <w:p>
-            <w:pPr>
-              <w:pStyle w:val="ContactInfo"/>
-              <w:jc w:val="left"/>
-              <w:rPr>
-                <w:rFonts w:ascii="arial" w:hAnsi="arial"/>
+                <w:rFonts w:ascii="Calibri" w:hAnsi="Calibri" w:cs="Calibri"/>
                 <w:sz w:val="18"/>
                 <w:szCs w:val="18"/>
                 <w:lang w:val="en-CA"/>
@@ -93,106 +92,7 @@
             </w:pPr>
             <w:r>
               <w:rPr>
-                <w:rFonts w:ascii="arial" w:hAnsi="arial"/>
-                <w:sz w:val="18"/>
-                <w:szCs w:val="18"/>
-                <w:lang w:val="en-CA"/>
-              </w:rPr>
-              <w:t>562 Reardon Private, K1V 2L1</w:t>
-            </w:r>
-          </w:p>
-        </w:tc>
-      </w:tr>
-      <w:tr>
-        <w:trPr/>
-        <w:tc>
-          <w:tcPr>
-            <w:tcW w:w="1813" w:type="dxa"/>
-            <w:tcBorders/>
-          </w:tcPr>
-          <w:p>
-            <w:pPr>
-              <w:pStyle w:val="ContactInfo"/>
-              <w:tabs>
-                <w:tab w:val="clear" w:pos="9360"/>
-              </w:tabs>
-              <w:jc w:val="right"/>
-              <w:rPr>
-                <w:rFonts w:ascii="arial" w:hAnsi="arial"/>
-                <w:sz w:val="18"/>
-                <w:szCs w:val="18"/>
-                <w:lang w:val="en-CA"/>
-              </w:rPr>
-            </w:pPr>
-            <w:r>
-              <w:rPr>
-                <w:rFonts w:ascii="arial" w:hAnsi="arial"/>
-                <w:sz w:val="18"/>
-                <w:szCs w:val="18"/>
-                <w:lang w:val="en-CA"/>
-              </w:rPr>
-              <w:t xml:space="preserve">Mississauga, </w:t>
-            </w:r>
-            <w:r>
-              <w:rPr>
-                <w:rFonts w:ascii="arial" w:hAnsi="arial"/>
-                <w:sz w:val="18"/>
-                <w:szCs w:val="18"/>
-                <w:lang w:val="en-CA"/>
-              </w:rPr>
-              <w:t>Ontario</w:t>
-            </w:r>
-          </w:p>
-        </w:tc>
-        <w:tc>
-          <w:tcPr>
-            <w:tcW w:w="2573" w:type="dxa"/>
-            <w:tcBorders/>
-          </w:tcPr>
-          <w:p>
-            <w:pPr>
-              <w:pStyle w:val="ContactInfo"/>
-              <w:jc w:val="left"/>
-              <w:rPr>
-                <w:rFonts w:ascii="arial" w:hAnsi="arial"/>
-                <w:sz w:val="18"/>
-                <w:szCs w:val="18"/>
-                <w:lang w:val="en-CA"/>
-              </w:rPr>
-            </w:pPr>
-            <w:r>
-              <w:rPr>
-                <w:rFonts w:ascii="arial" w:hAnsi="arial"/>
-                <w:sz w:val="18"/>
-                <w:szCs w:val="18"/>
-                <w:lang w:val="en-CA"/>
-              </w:rPr>
-              <w:t>4060 Farrier Court, L5L 2Y4</w:t>
-            </w:r>
-          </w:p>
-        </w:tc>
-      </w:tr>
-      <w:tr>
-        <w:trPr/>
-        <w:tc>
-          <w:tcPr>
-            <w:tcW w:w="1813" w:type="dxa"/>
-            <w:tcBorders/>
-          </w:tcPr>
-          <w:p>
-            <w:pPr>
-              <w:pStyle w:val="ContactInfo"/>
-              <w:jc w:val="right"/>
-              <w:rPr>
-                <w:rFonts w:ascii="arial" w:hAnsi="arial"/>
-                <w:sz w:val="18"/>
-                <w:szCs w:val="18"/>
-                <w:lang w:val="en-CA"/>
-              </w:rPr>
-            </w:pPr>
-            <w:r>
-              <w:rPr>
-                <w:rFonts w:ascii="arial" w:hAnsi="arial"/>
+                <w:rFonts w:cs="Calibri" w:ascii="Calibri" w:hAnsi="Calibri"/>
                 <w:sz w:val="18"/>
                 <w:szCs w:val="18"/>
                 <w:lang w:val="en-CA"/>
@@ -211,7 +111,7 @@
               <w:pStyle w:val="ContactInfo"/>
               <w:jc w:val="left"/>
               <w:rPr>
-                <w:rFonts w:ascii="arial" w:hAnsi="arial"/>
+                <w:rFonts w:ascii="Calibri" w:hAnsi="Calibri" w:cs="Calibri"/>
                 <w:sz w:val="18"/>
                 <w:szCs w:val="18"/>
                 <w:lang w:val="en-CA"/>
@@ -219,7 +119,7 @@
             </w:pPr>
             <w:r>
               <w:rPr>
-                <w:rFonts w:ascii="arial" w:hAnsi="arial"/>
+                <w:rFonts w:cs="Calibri" w:ascii="Calibri" w:hAnsi="Calibri"/>
                 <w:sz w:val="18"/>
                 <w:szCs w:val="18"/>
                 <w:lang w:val="en-CA"/>
@@ -285,132 +185,17 @@
           <w:tab w:val="clear" w:pos="9360"/>
         </w:tabs>
         <w:spacing w:before="0" w:after="0"/>
-        <w:rPr/>
-      </w:pPr>
-      <w:r>
-        <w:rPr>
-          <w:rFonts w:cs="Calibri" w:ascii="Calibri" w:hAnsi="Calibri"/>
-          <w:lang w:val="en-CA"/>
-        </w:rPr>
-        <w:t>Qualified for</w:t>
-      </w:r>
-      <w:r>
-        <w:rPr>
-          <w:rFonts w:cs="Calibri" w:ascii="Calibri" w:hAnsi="Calibri"/>
-          <w:lang w:val="en-CA"/>
-        </w:rPr>
-        <w:t xml:space="preserve"> </w:t>
-      </w:r>
-      <w:r>
-        <w:rPr>
-          <w:rFonts w:cs="Calibri" w:ascii="Calibri" w:hAnsi="Calibri"/>
-          <w:lang w:val="en-CA"/>
-        </w:rPr>
-        <w:t>Computer Software Developer,</w:t>
-      </w:r>
-      <w:r>
-        <w:rPr>
-          <w:rFonts w:cs="Calibri" w:ascii="Calibri" w:hAnsi="Calibri"/>
-          <w:lang w:val="en-CA"/>
-        </w:rPr>
-        <w:t xml:space="preserve"> </w:t>
-      </w:r>
-      <w:r>
-        <w:rPr>
-          <w:rFonts w:cs="Calibri" w:ascii="Calibri" w:hAnsi="Calibri"/>
-          <w:lang w:val="en-CA"/>
-        </w:rPr>
-        <w:t xml:space="preserve">IT, </w:t>
-      </w:r>
-      <w:r>
-        <w:rPr>
-          <w:rFonts w:cs="Calibri" w:ascii="Calibri" w:hAnsi="Calibri"/>
-          <w:lang w:val="en-CA"/>
-        </w:rPr>
-        <w:t>Lab assistant</w:t>
-      </w:r>
-      <w:r>
-        <w:rPr>
-          <w:rFonts w:cs="Calibri" w:ascii="Calibri" w:hAnsi="Calibri"/>
-          <w:lang w:val="en-CA"/>
-        </w:rPr>
-        <w:t xml:space="preserve"> </w:t>
-      </w:r>
-      <w:r>
-        <w:rPr>
-          <w:rFonts w:cs="Calibri" w:ascii="Calibri" w:hAnsi="Calibri"/>
-          <w:lang w:val="en-CA"/>
-        </w:rPr>
-        <w:t>and research positions.</w:t>
-      </w:r>
-    </w:p>
-    <w:p>
-      <w:pPr>
-        <w:pStyle w:val="ListParagraph"/>
-        <w:numPr>
-          <w:ilvl w:val="0"/>
-          <w:numId w:val="2"/>
-        </w:numPr>
-        <w:tabs>
-          <w:tab w:val="clear" w:pos="9360"/>
-        </w:tabs>
-        <w:spacing w:before="0" w:after="0"/>
-        <w:rPr>
-          <w:rFonts w:ascii="Calibri" w:hAnsi="Calibri" w:cs="Calibri"/>
-          <w:lang w:val="en-CA"/>
-        </w:rPr>
-      </w:pPr>
-      <w:r>
-        <w:rPr>
-          <w:rFonts w:cs="Calibri" w:ascii="Calibri" w:hAnsi="Calibri"/>
-          <w:lang w:val="en-CA"/>
-        </w:rPr>
-        <w:t>I have both applied computer science and broad science, technology and environmental educatio</w:t>
-      </w:r>
-      <w:r>
-        <w:rPr>
-          <w:rFonts w:cs="Calibri" w:ascii="Calibri" w:hAnsi="Calibri"/>
-          <w:lang w:val="en-CA"/>
-        </w:rPr>
-        <w:t>n.</w:t>
-      </w:r>
-    </w:p>
-    <w:p>
-      <w:pPr>
-        <w:pStyle w:val="ListParagraph"/>
-        <w:numPr>
-          <w:ilvl w:val="0"/>
-          <w:numId w:val="2"/>
-        </w:numPr>
-        <w:tabs>
-          <w:tab w:val="clear" w:pos="9360"/>
-        </w:tabs>
-        <w:spacing w:before="0" w:after="0"/>
-        <w:rPr>
-          <w:rFonts w:ascii="Calibri" w:hAnsi="Calibri" w:cs="Calibri"/>
-          <w:lang w:val="en-CA"/>
-        </w:rPr>
-      </w:pPr>
-      <w:r>
-        <w:rPr>
-          <w:rFonts w:cs="Calibri" w:ascii="Calibri" w:hAnsi="Calibri"/>
-          <w:lang w:val="en-CA"/>
-        </w:rPr>
-        <w:t>M</w:t>
-      </w:r>
-      <w:r>
-        <w:rPr>
-          <w:rFonts w:cs="Calibri" w:ascii="Calibri" w:hAnsi="Calibri"/>
-          <w:lang w:val="en-CA"/>
-        </w:rPr>
-        <w:t xml:space="preserve">ajority of work experience; working while studying to finance my education </w:t>
-      </w:r>
-      <w:r>
-        <w:rPr>
-          <w:rFonts w:cs="Calibri" w:ascii="Calibri" w:hAnsi="Calibri"/>
-          <w:lang w:val="en-CA"/>
-        </w:rPr>
-        <w:t>and living expenses.</w:t>
+        <w:rPr>
+          <w:rFonts w:ascii="Calibri" w:hAnsi="Calibri" w:cs="Calibri"/>
+          <w:lang w:val="en-CA"/>
+        </w:rPr>
+      </w:pPr>
+      <w:r>
+        <w:rPr>
+          <w:rFonts w:cs="Calibri" w:ascii="Calibri" w:hAnsi="Calibri"/>
+          <w:lang w:val="en-CA"/>
+        </w:rPr>
+        <w:t>Applied computer science as well as broad general science education and experience.</w:t>
       </w:r>
     </w:p>
     <w:p>
@@ -430,7 +215,43 @@
           <w:szCs w:val="22"/>
           <w:lang w:val="en-CA"/>
         </w:rPr>
+      </w:r>
+    </w:p>
+    <w:p>
+      <w:pPr>
+        <w:pStyle w:val="Heading1"/>
+        <w:rPr>
+          <w:rFonts w:ascii="Calibri" w:hAnsi="Calibri" w:cs="Calibri"/>
+          <w:sz w:val="22"/>
+          <w:szCs w:val="22"/>
+          <w:lang w:val="en-CA"/>
+        </w:rPr>
+      </w:pPr>
+      <w:r>
+        <w:rPr>
+          <w:rFonts w:cs="Calibri" w:ascii="Calibri" w:hAnsi="Calibri"/>
+          <w:sz w:val="22"/>
+          <w:szCs w:val="22"/>
+          <w:lang w:val="en-CA"/>
+        </w:rPr>
         <w:t>Education</w:t>
+      </w:r>
+    </w:p>
+    <w:p>
+      <w:pPr>
+        <w:pStyle w:val="Normal"/>
+        <w:spacing w:before="120" w:after="0"/>
+        <w:rPr>
+          <w:rStyle w:val="NormalBold"/>
+          <w:rFonts w:ascii="Calibri" w:hAnsi="Calibri" w:cs="Calibri"/>
+          <w:lang w:val="en-CA"/>
+        </w:rPr>
+      </w:pPr>
+      <w:r>
+        <w:rPr>
+          <w:rFonts w:cs="Calibri" w:ascii="Calibri" w:hAnsi="Calibri"/>
+          <w:lang w:val="en-CA"/>
+        </w:rPr>
       </w:r>
     </w:p>
     <w:p>
@@ -468,39 +289,7 @@
           <w:rFonts w:cs="Calibri" w:ascii="Calibri" w:hAnsi="Calibri"/>
           <w:lang w:val="en-CA"/>
         </w:rPr>
-        <w:t>B</w:t>
-      </w:r>
-      <w:r>
-        <w:rPr>
-          <w:rStyle w:val="NormalItalic"/>
-          <w:rFonts w:cs="Calibri" w:ascii="Calibri" w:hAnsi="Calibri"/>
-          <w:lang w:val="en-CA"/>
-        </w:rPr>
-        <w:t>achelor of</w:t>
-      </w:r>
-      <w:r>
-        <w:rPr>
-          <w:rStyle w:val="NormalItalic"/>
-          <w:rFonts w:cs="Calibri" w:ascii="Calibri" w:hAnsi="Calibri"/>
-          <w:lang w:val="en-CA"/>
-        </w:rPr>
-        <w:t xml:space="preserve"> Computer Science </w:t>
-      </w:r>
-      <w:r>
-        <w:rPr>
-          <w:rStyle w:val="NormalItalic"/>
-          <w:rFonts w:cs="Calibri" w:ascii="Calibri" w:hAnsi="Calibri"/>
-          <w:lang w:val="en-CA"/>
-        </w:rPr>
-        <w:t xml:space="preserve">Major, Minor in </w:t>
-      </w:r>
-      <w:r>
-        <w:rPr>
-          <w:rStyle w:val="NormalItalic"/>
-          <w:rFonts w:cs="Calibri" w:ascii="Calibri" w:hAnsi="Calibri"/>
-          <w:lang w:val="en-CA"/>
-        </w:rPr>
-        <w:t>Sociology</w:t>
+        <w:t>Bachelor of Computer Science Major, Minor in Sociology</w:t>
       </w:r>
       <w:r>
         <w:rPr>
@@ -508,20 +297,7 @@
           <w:lang w:val="en-CA"/>
         </w:rPr>
         <w:tab/>
-      </w:r>
-      <w:r>
-        <w:rPr>
-          <w:rFonts w:cs="Calibri" w:ascii="Calibri" w:hAnsi="Calibri"/>
-          <w:lang w:val="en-CA"/>
-        </w:rPr>
-        <w:t xml:space="preserve">2015 - </w:t>
-      </w:r>
-      <w:r>
-        <w:rPr>
-          <w:rFonts w:cs="Calibri" w:ascii="Calibri" w:hAnsi="Calibri"/>
-          <w:lang w:val="en-CA"/>
-        </w:rPr>
-        <w:t>2019</w:t>
+        <w:t>2015 - 2019</w:t>
       </w:r>
     </w:p>
     <w:p>
@@ -533,10 +309,7 @@
         </w:rPr>
       </w:pPr>
       <w:r>
-        <w:rPr>
-          <w:rFonts w:cs="Calibri" w:ascii="Calibri" w:hAnsi="Calibri"/>
-          <w:lang w:val="en-CA"/>
-        </w:rPr>
+        <w:rPr/>
       </w:r>
     </w:p>
     <w:p>
@@ -574,47 +347,7 @@
           <w:rFonts w:cs="Calibri" w:ascii="Calibri" w:hAnsi="Calibri"/>
           <w:lang w:val="en-CA"/>
         </w:rPr>
-        <w:t>B</w:t>
-      </w:r>
-      <w:r>
-        <w:rPr>
-          <w:rStyle w:val="NormalItalic"/>
-          <w:rFonts w:cs="Calibri" w:ascii="Calibri" w:hAnsi="Calibri"/>
-          <w:lang w:val="en-CA"/>
-        </w:rPr>
-        <w:t>achelor of Science</w:t>
-      </w:r>
-      <w:r>
-        <w:rPr>
-          <w:rStyle w:val="NormalItalic"/>
-          <w:rFonts w:cs="Calibri" w:ascii="Calibri" w:hAnsi="Calibri"/>
-          <w:lang w:val="en-CA"/>
-        </w:rPr>
-        <w:t>:</w:t>
-      </w:r>
-      <w:r>
-        <w:rPr>
-          <w:rStyle w:val="NormalItalic"/>
-          <w:rFonts w:cs="Calibri" w:ascii="Calibri" w:hAnsi="Calibri"/>
-          <w:lang w:val="en-CA"/>
-        </w:rPr>
-        <w:t xml:space="preserve"> Integrated Science, </w:t>
-      </w:r>
-      <w:r>
-        <w:rPr>
-          <w:rStyle w:val="NormalItalic"/>
-          <w:rFonts w:cs="Calibri" w:ascii="Calibri" w:hAnsi="Calibri"/>
-          <w:lang w:val="en-CA"/>
-        </w:rPr>
-        <w:t>Concentration in Science</w:t>
-      </w:r>
-      <w:r>
-        <w:rPr>
-          <w:rStyle w:val="NormalItalic"/>
-          <w:rFonts w:cs="Calibri" w:ascii="Calibri" w:hAnsi="Calibri"/>
-          <w:lang w:val="en-CA"/>
-        </w:rPr>
-        <w:t xml:space="preserve"> and Technology</w:t>
+        <w:t>Bachelor of Science: Integrated Science, Concentration in Science and Technology</w:t>
       </w:r>
       <w:r>
         <w:rPr>
@@ -622,20 +355,7 @@
           <w:lang w:val="en-CA"/>
         </w:rPr>
         <w:tab/>
-      </w:r>
-      <w:r>
-        <w:rPr>
-          <w:rFonts w:cs="Calibri" w:ascii="Calibri" w:hAnsi="Calibri"/>
-          <w:lang w:val="en-CA"/>
-        </w:rPr>
-        <w:t xml:space="preserve">2009 - </w:t>
-      </w:r>
-      <w:r>
-        <w:rPr>
-          <w:rFonts w:cs="Calibri" w:ascii="Calibri" w:hAnsi="Calibri"/>
-          <w:lang w:val="en-CA"/>
-        </w:rPr>
-        <w:t>2014</w:t>
+        <w:t>2009 - 2014</w:t>
       </w:r>
     </w:p>
     <w:p>
@@ -656,411 +376,12 @@
           <w:szCs w:val="22"/>
           <w:lang w:val="en-CA"/>
         </w:rPr>
-        <w:t>Technology Skills</w:t>
-      </w:r>
-    </w:p>
-    <w:p>
-      <w:pPr>
-        <w:pStyle w:val="Normal"/>
-        <w:numPr>
-          <w:ilvl w:val="0"/>
-          <w:numId w:val="2"/>
-        </w:numPr>
-        <w:tabs>
-          <w:tab w:val="clear" w:pos="9360"/>
-        </w:tabs>
-        <w:spacing w:before="0" w:after="0"/>
-        <w:rPr>
-          <w:rFonts w:ascii="Calibri" w:hAnsi="Calibri" w:cs="Calibri"/>
-          <w:lang w:val="en-CA"/>
-        </w:rPr>
-      </w:pPr>
-      <w:r>
-        <w:rPr>
-          <w:rFonts w:cs="Calibri" w:ascii="Calibri" w:hAnsi="Calibri"/>
-          <w:lang w:val="en-CA"/>
-        </w:rPr>
-        <w:t xml:space="preserve">C++ </w:t>
-      </w:r>
-      <w:r>
-        <w:rPr>
-          <w:rFonts w:cs="Calibri" w:ascii="Calibri" w:hAnsi="Calibri"/>
-          <w:lang w:val="en-CA"/>
-        </w:rPr>
-        <w:t>and Java</w:t>
-      </w:r>
-    </w:p>
-    <w:p>
-      <w:pPr>
-        <w:pStyle w:val="Normal"/>
-        <w:numPr>
-          <w:ilvl w:val="0"/>
-          <w:numId w:val="2"/>
-        </w:numPr>
-        <w:tabs>
-          <w:tab w:val="clear" w:pos="9360"/>
-        </w:tabs>
-        <w:spacing w:before="0" w:after="0"/>
-        <w:rPr>
-          <w:rFonts w:ascii="Calibri" w:hAnsi="Calibri" w:cs="Calibri"/>
-          <w:lang w:val="en-CA"/>
-        </w:rPr>
-      </w:pPr>
-      <w:r>
-        <w:rPr>
-          <w:rFonts w:cs="Calibri" w:ascii="Calibri" w:hAnsi="Calibri"/>
-          <w:lang w:val="en-CA"/>
-        </w:rPr>
-        <w:t xml:space="preserve">Windows (Batch </w:t>
-      </w:r>
-      <w:r>
-        <w:rPr>
-          <w:rFonts w:cs="Calibri" w:ascii="Calibri" w:hAnsi="Calibri"/>
-          <w:lang w:val="en-CA"/>
-        </w:rPr>
-        <w:t>scripting</w:t>
-      </w:r>
-      <w:r>
-        <w:rPr>
-          <w:rFonts w:cs="Calibri" w:ascii="Calibri" w:hAnsi="Calibri"/>
-          <w:lang w:val="en-CA"/>
-        </w:rPr>
-        <w:t>) and Linux (Ba</w:t>
-      </w:r>
-      <w:r>
-        <w:rPr>
-          <w:rFonts w:cs="Calibri" w:ascii="Calibri" w:hAnsi="Calibri"/>
-          <w:lang w:val="en-CA"/>
-        </w:rPr>
-        <w:t>s</w:t>
-      </w:r>
-      <w:r>
-        <w:rPr>
-          <w:rFonts w:cs="Calibri" w:ascii="Calibri" w:hAnsi="Calibri"/>
-          <w:lang w:val="en-CA"/>
-        </w:rPr>
-        <w:t xml:space="preserve">h </w:t>
-      </w:r>
-      <w:r>
-        <w:rPr>
-          <w:rFonts w:cs="Calibri" w:ascii="Calibri" w:hAnsi="Calibri"/>
-          <w:lang w:val="en-CA"/>
-        </w:rPr>
-        <w:t>scripting</w:t>
-      </w:r>
-      <w:r>
-        <w:rPr>
-          <w:rFonts w:cs="Calibri" w:ascii="Calibri" w:hAnsi="Calibri"/>
-          <w:lang w:val="en-CA"/>
-        </w:rPr>
-        <w:t>).</w:t>
-      </w:r>
-    </w:p>
-    <w:p>
-      <w:pPr>
-        <w:pStyle w:val="Normal"/>
-        <w:numPr>
-          <w:ilvl w:val="0"/>
-          <w:numId w:val="2"/>
-        </w:numPr>
-        <w:tabs>
-          <w:tab w:val="clear" w:pos="9360"/>
-        </w:tabs>
-        <w:spacing w:before="0" w:after="0"/>
-        <w:rPr>
-          <w:rFonts w:ascii="Calibri" w:hAnsi="Calibri" w:cs="Calibri"/>
-          <w:lang w:val="en-CA"/>
-        </w:rPr>
-      </w:pPr>
-      <w:r>
-        <w:rPr>
-          <w:rFonts w:cs="Calibri" w:ascii="Calibri" w:hAnsi="Calibri"/>
-          <w:lang w:val="en-CA"/>
-        </w:rPr>
-        <w:t>OS Kernel programming on Linux.</w:t>
-      </w:r>
-    </w:p>
-    <w:p>
-      <w:pPr>
-        <w:pStyle w:val="Normal"/>
-        <w:numPr>
-          <w:ilvl w:val="0"/>
-          <w:numId w:val="2"/>
-        </w:numPr>
-        <w:tabs>
-          <w:tab w:val="clear" w:pos="9360"/>
-        </w:tabs>
-        <w:spacing w:before="0" w:after="0"/>
-        <w:rPr>
-          <w:rFonts w:ascii="Calibri" w:hAnsi="Calibri" w:cs="Calibri"/>
-          <w:lang w:val="en-CA"/>
-        </w:rPr>
-      </w:pPr>
-      <w:r>
-        <w:rPr>
-          <w:rFonts w:cs="Calibri" w:ascii="Calibri" w:hAnsi="Calibri"/>
-          <w:lang w:val="en-CA"/>
-        </w:rPr>
-        <w:t>Databases: Oracle SQL, mySQL, MongoDB.</w:t>
-      </w:r>
-    </w:p>
-    <w:p>
-      <w:pPr>
-        <w:pStyle w:val="Normal"/>
-        <w:numPr>
-          <w:ilvl w:val="0"/>
-          <w:numId w:val="2"/>
-        </w:numPr>
-        <w:tabs>
-          <w:tab w:val="clear" w:pos="9360"/>
-        </w:tabs>
-        <w:spacing w:before="0" w:after="0"/>
-        <w:rPr>
-          <w:rFonts w:ascii="Calibri" w:hAnsi="Calibri" w:cs="Calibri"/>
-          <w:lang w:val="en-CA"/>
-        </w:rPr>
-      </w:pPr>
-      <w:r>
-        <w:rPr>
-          <w:rFonts w:cs="Calibri" w:ascii="Calibri" w:hAnsi="Calibri"/>
-          <w:lang w:val="en-CA"/>
-        </w:rPr>
-        <w:t>Git; using GitHub for collaboration and version control.</w:t>
-      </w:r>
-    </w:p>
-    <w:p>
-      <w:pPr>
-        <w:pStyle w:val="Normal"/>
-        <w:numPr>
-          <w:ilvl w:val="0"/>
-          <w:numId w:val="2"/>
-        </w:numPr>
-        <w:tabs>
-          <w:tab w:val="clear" w:pos="9360"/>
-        </w:tabs>
-        <w:spacing w:before="0" w:after="0"/>
-        <w:rPr>
-          <w:rFonts w:ascii="Calibri" w:hAnsi="Calibri" w:cs="Calibri"/>
-          <w:lang w:val="en-CA"/>
-        </w:rPr>
-      </w:pPr>
-      <w:r>
-        <w:rPr>
-          <w:rFonts w:cs="Calibri" w:ascii="Calibri" w:hAnsi="Calibri"/>
-          <w:lang w:val="en-CA"/>
-        </w:rPr>
-        <w:t>XML, JSON, CSS, JavaScript, PHP, HTML5. Used Bootstrap-5 and additional frameworks.</w:t>
-      </w:r>
-    </w:p>
-    <w:p>
-      <w:pPr>
-        <w:pStyle w:val="Normal"/>
-        <w:numPr>
-          <w:ilvl w:val="0"/>
-          <w:numId w:val="2"/>
-        </w:numPr>
-        <w:tabs>
-          <w:tab w:val="clear" w:pos="9360"/>
-        </w:tabs>
-        <w:spacing w:before="0" w:after="0"/>
-        <w:rPr>
-          <w:rFonts w:ascii="Calibri" w:hAnsi="Calibri" w:cs="Calibri"/>
-          <w:lang w:val="en-CA"/>
-        </w:rPr>
-      </w:pPr>
-      <w:r>
-        <w:rPr>
-          <w:rFonts w:cs="Calibri" w:ascii="Calibri" w:hAnsi="Calibri"/>
-          <w:lang w:val="en-CA"/>
-        </w:rPr>
-        <w:t>Favorite IDE: Dreamweaver (Windows) and Wappler (Linux).</w:t>
-      </w:r>
-    </w:p>
-    <w:p>
-      <w:pPr>
-        <w:pStyle w:val="Normal"/>
-        <w:numPr>
-          <w:ilvl w:val="0"/>
-          <w:numId w:val="2"/>
-        </w:numPr>
-        <w:tabs>
-          <w:tab w:val="clear" w:pos="9360"/>
-        </w:tabs>
-        <w:spacing w:before="0" w:after="0"/>
-        <w:rPr>
-          <w:rFonts w:ascii="Calibri" w:hAnsi="Calibri" w:cs="Calibri"/>
-          <w:lang w:val="en-CA"/>
-        </w:rPr>
-      </w:pPr>
-      <w:r>
-        <w:rPr>
-          <w:rFonts w:cs="Calibri" w:ascii="Calibri" w:hAnsi="Calibri"/>
-          <w:lang w:val="en-CA"/>
-        </w:rPr>
-        <w:t>OpenSource Matomo (Formally PIWIK)</w:t>
-      </w:r>
-    </w:p>
-    <w:p>
-      <w:pPr>
-        <w:pStyle w:val="Normal"/>
-        <w:numPr>
-          <w:ilvl w:val="0"/>
-          <w:numId w:val="2"/>
-        </w:numPr>
-        <w:tabs>
-          <w:tab w:val="clear" w:pos="9360"/>
-        </w:tabs>
-        <w:spacing w:before="0" w:after="0"/>
-        <w:rPr>
-          <w:rFonts w:ascii="Calibri" w:hAnsi="Calibri" w:cs="Calibri"/>
-          <w:lang w:val="en-CA"/>
-        </w:rPr>
-      </w:pPr>
-      <w:r>
-        <w:rPr>
-          <w:rFonts w:cs="Calibri" w:ascii="Calibri" w:hAnsi="Calibri"/>
-          <w:lang w:val="en-CA"/>
-        </w:rPr>
-        <w:t>Google Analytics</w:t>
-      </w:r>
-    </w:p>
-    <w:p>
-      <w:pPr>
-        <w:pStyle w:val="Normal"/>
-        <w:numPr>
-          <w:ilvl w:val="0"/>
-          <w:numId w:val="2"/>
-        </w:numPr>
-        <w:tabs>
-          <w:tab w:val="clear" w:pos="9360"/>
-        </w:tabs>
-        <w:spacing w:before="0" w:after="0"/>
-        <w:rPr>
-          <w:rFonts w:ascii="Calibri" w:hAnsi="Calibri" w:cs="Calibri"/>
-          <w:lang w:val="en-CA"/>
-        </w:rPr>
-      </w:pPr>
-      <w:r>
-        <w:rPr>
-          <w:rFonts w:cs="Calibri" w:ascii="Calibri" w:hAnsi="Calibri"/>
-          <w:lang w:val="en-CA"/>
-        </w:rPr>
-        <w:t>Microsoft Internet Information Services (IIS)</w:t>
-      </w:r>
-    </w:p>
-    <w:p>
-      <w:pPr>
-        <w:pStyle w:val="Normal"/>
-        <w:numPr>
-          <w:ilvl w:val="0"/>
-          <w:numId w:val="2"/>
-        </w:numPr>
-        <w:tabs>
-          <w:tab w:val="clear" w:pos="9360"/>
-        </w:tabs>
-        <w:spacing w:before="0" w:after="0"/>
-        <w:rPr>
-          <w:rFonts w:ascii="Calibri" w:hAnsi="Calibri" w:cs="Calibri"/>
-          <w:lang w:val="en-CA"/>
-        </w:rPr>
-      </w:pPr>
-      <w:r>
-        <w:rPr>
-          <w:rFonts w:cs="Calibri" w:ascii="Calibri" w:hAnsi="Calibri"/>
-          <w:lang w:val="en-CA"/>
-        </w:rPr>
-        <w:t>Linux with Apache Server (for testing before going live)</w:t>
-      </w:r>
-    </w:p>
-    <w:p>
-      <w:pPr>
-        <w:pStyle w:val="Normal"/>
-        <w:numPr>
-          <w:ilvl w:val="0"/>
-          <w:numId w:val="2"/>
-        </w:numPr>
-        <w:tabs>
-          <w:tab w:val="clear" w:pos="9360"/>
-        </w:tabs>
-        <w:spacing w:before="0" w:after="0"/>
-        <w:rPr>
-          <w:rFonts w:ascii="Calibri" w:hAnsi="Calibri" w:cs="Calibri"/>
-          <w:lang w:val="en-CA"/>
-        </w:rPr>
-      </w:pPr>
-      <w:r>
-        <w:rPr>
-          <w:rFonts w:cs="Calibri" w:ascii="Calibri" w:hAnsi="Calibri"/>
-          <w:lang w:val="en-CA"/>
-        </w:rPr>
-        <w:t>Computer/Network Security: Burp, Wireshark, and Packet Tracing.</w:t>
-      </w:r>
-    </w:p>
-    <w:p>
-      <w:pPr>
-        <w:pStyle w:val="Normal"/>
-        <w:numPr>
-          <w:ilvl w:val="0"/>
-          <w:numId w:val="2"/>
-        </w:numPr>
-        <w:tabs>
-          <w:tab w:val="clear" w:pos="9360"/>
-        </w:tabs>
-        <w:spacing w:before="0" w:after="0"/>
-        <w:rPr>
-          <w:rFonts w:ascii="Calibri" w:hAnsi="Calibri" w:cs="Calibri"/>
-          <w:lang w:val="en-CA"/>
-        </w:rPr>
-      </w:pPr>
-      <w:r>
-        <w:rPr>
-          <w:rFonts w:cs="Calibri" w:ascii="Calibri" w:hAnsi="Calibri"/>
-          <w:lang w:val="en-CA"/>
-        </w:rPr>
-        <w:t xml:space="preserve">MS Office programs including advanced skills </w:t>
-      </w:r>
-      <w:r>
-        <w:rPr>
-          <w:rFonts w:cs="Calibri" w:ascii="Calibri" w:hAnsi="Calibri"/>
-          <w:lang w:val="en-CA"/>
-        </w:rPr>
-        <w:t>such as physics tables</w:t>
-      </w:r>
-      <w:r>
-        <w:rPr>
-          <w:rFonts w:cs="Calibri" w:ascii="Calibri" w:hAnsi="Calibri"/>
-          <w:lang w:val="en-CA"/>
-        </w:rPr>
-        <w:t xml:space="preserve"> with Excel.</w:t>
-      </w:r>
-    </w:p>
-    <w:p>
-      <w:pPr>
-        <w:pStyle w:val="Normal"/>
-        <w:numPr>
-          <w:ilvl w:val="0"/>
-          <w:numId w:val="2"/>
-        </w:numPr>
-        <w:tabs>
-          <w:tab w:val="clear" w:pos="9360"/>
-        </w:tabs>
-        <w:spacing w:before="0" w:after="0"/>
-        <w:rPr>
-          <w:rFonts w:ascii="Calibri" w:hAnsi="Calibri" w:cs="Calibri"/>
-          <w:lang w:val="en-CA"/>
-        </w:rPr>
-      </w:pPr>
-      <w:r>
-        <w:rPr>
-          <w:rFonts w:cs="Calibri" w:ascii="Calibri" w:hAnsi="Calibri"/>
-          <w:lang w:val="en-CA"/>
-        </w:rPr>
-        <w:t>Adobe Photoshop and Premier.</w:t>
       </w:r>
     </w:p>
     <w:p>
       <w:pPr>
         <w:pStyle w:val="Heading1"/>
+        <w:spacing w:before="120" w:after="0"/>
         <w:rPr>
           <w:rFonts w:ascii="Calibri" w:hAnsi="Calibri" w:cs="Calibri"/>
           <w:sz w:val="22"/>
@@ -1075,7 +396,418 @@
           <w:szCs w:val="22"/>
           <w:lang w:val="en-CA"/>
         </w:rPr>
+        <w:t>Technology Skills</w:t>
+      </w:r>
+    </w:p>
+    <w:p>
+      <w:pPr>
+        <w:pStyle w:val="Normal"/>
+        <w:tabs>
+          <w:tab w:val="clear" w:pos="9360"/>
+        </w:tabs>
+        <w:spacing w:before="0" w:after="0"/>
+        <w:ind w:left="360" w:right="0" w:hanging="0"/>
+        <w:rPr>
+          <w:rFonts w:ascii="Calibri" w:hAnsi="Calibri" w:cs="Calibri"/>
+          <w:lang w:val="en-CA"/>
+        </w:rPr>
+      </w:pPr>
+      <w:r>
+        <w:rPr>
+          <w:rFonts w:cs="Calibri" w:ascii="Calibri" w:hAnsi="Calibri"/>
+          <w:lang w:val="en-CA"/>
+        </w:rPr>
+      </w:r>
+    </w:p>
+    <w:p>
+      <w:pPr>
+        <w:pStyle w:val="Normal"/>
+        <w:numPr>
+          <w:ilvl w:val="0"/>
+          <w:numId w:val="2"/>
+        </w:numPr>
+        <w:tabs>
+          <w:tab w:val="clear" w:pos="9360"/>
+        </w:tabs>
+        <w:spacing w:before="0" w:after="0"/>
+        <w:rPr>
+          <w:rFonts w:ascii="Calibri" w:hAnsi="Calibri" w:cs="Calibri"/>
+          <w:lang w:val="en-CA"/>
+        </w:rPr>
+      </w:pPr>
+      <w:r>
+        <w:rPr>
+          <w:rFonts w:cs="Calibri" w:ascii="Calibri" w:hAnsi="Calibri"/>
+          <w:lang w:val="en-CA"/>
+        </w:rPr>
+        <w:t>C++ and Java</w:t>
+      </w:r>
+    </w:p>
+    <w:p>
+      <w:pPr>
+        <w:pStyle w:val="Normal"/>
+        <w:numPr>
+          <w:ilvl w:val="0"/>
+          <w:numId w:val="2"/>
+        </w:numPr>
+        <w:tabs>
+          <w:tab w:val="clear" w:pos="9360"/>
+        </w:tabs>
+        <w:spacing w:before="0" w:after="0"/>
+        <w:rPr>
+          <w:rFonts w:ascii="Calibri" w:hAnsi="Calibri" w:cs="Calibri"/>
+          <w:lang w:val="en-CA"/>
+        </w:rPr>
+      </w:pPr>
+      <w:r>
+        <w:rPr>
+          <w:rFonts w:cs="Calibri" w:ascii="Calibri" w:hAnsi="Calibri"/>
+          <w:lang w:val="en-CA"/>
+        </w:rPr>
+        <w:t>Windows (Batch scripting) and Linux (Bash scripting).</w:t>
+      </w:r>
+    </w:p>
+    <w:p>
+      <w:pPr>
+        <w:pStyle w:val="Normal"/>
+        <w:numPr>
+          <w:ilvl w:val="0"/>
+          <w:numId w:val="2"/>
+        </w:numPr>
+        <w:tabs>
+          <w:tab w:val="clear" w:pos="9360"/>
+        </w:tabs>
+        <w:spacing w:before="0" w:after="0"/>
+        <w:rPr>
+          <w:rFonts w:ascii="Calibri" w:hAnsi="Calibri" w:cs="Calibri"/>
+          <w:lang w:val="en-CA"/>
+        </w:rPr>
+      </w:pPr>
+      <w:r>
+        <w:rPr>
+          <w:rFonts w:cs="Calibri" w:ascii="Calibri" w:hAnsi="Calibri"/>
+          <w:lang w:val="en-CA"/>
+        </w:rPr>
+        <w:t>OS Kernel programming on Linux.</w:t>
+      </w:r>
+    </w:p>
+    <w:p>
+      <w:pPr>
+        <w:pStyle w:val="Normal"/>
+        <w:numPr>
+          <w:ilvl w:val="0"/>
+          <w:numId w:val="2"/>
+        </w:numPr>
+        <w:tabs>
+          <w:tab w:val="clear" w:pos="9360"/>
+        </w:tabs>
+        <w:spacing w:before="0" w:after="0"/>
+        <w:rPr>
+          <w:rFonts w:ascii="Calibri" w:hAnsi="Calibri" w:cs="Calibri"/>
+          <w:lang w:val="en-CA"/>
+        </w:rPr>
+      </w:pPr>
+      <w:r>
+        <w:rPr>
+          <w:rFonts w:cs="Calibri" w:ascii="Calibri" w:hAnsi="Calibri"/>
+          <w:lang w:val="en-CA"/>
+        </w:rPr>
+        <w:t>Databases: Oracle SQL, mySQL, MongoDB.</w:t>
+      </w:r>
+    </w:p>
+    <w:p>
+      <w:pPr>
+        <w:pStyle w:val="Normal"/>
+        <w:numPr>
+          <w:ilvl w:val="0"/>
+          <w:numId w:val="2"/>
+        </w:numPr>
+        <w:tabs>
+          <w:tab w:val="clear" w:pos="9360"/>
+        </w:tabs>
+        <w:spacing w:before="0" w:after="0"/>
+        <w:rPr>
+          <w:rFonts w:ascii="Calibri" w:hAnsi="Calibri" w:cs="Calibri"/>
+          <w:lang w:val="en-CA"/>
+        </w:rPr>
+      </w:pPr>
+      <w:r>
+        <w:rPr>
+          <w:rFonts w:cs="Calibri" w:ascii="Calibri" w:hAnsi="Calibri"/>
+          <w:lang w:val="en-CA"/>
+        </w:rPr>
+        <w:t>Git; using GitHub for collaboration and version control.</w:t>
+      </w:r>
+    </w:p>
+    <w:p>
+      <w:pPr>
+        <w:pStyle w:val="Normal"/>
+        <w:numPr>
+          <w:ilvl w:val="0"/>
+          <w:numId w:val="2"/>
+        </w:numPr>
+        <w:tabs>
+          <w:tab w:val="clear" w:pos="9360"/>
+        </w:tabs>
+        <w:spacing w:before="0" w:after="0"/>
+        <w:rPr>
+          <w:rFonts w:ascii="Calibri" w:hAnsi="Calibri" w:cs="Calibri"/>
+          <w:lang w:val="en-CA"/>
+        </w:rPr>
+      </w:pPr>
+      <w:r>
+        <w:rPr>
+          <w:rFonts w:cs="Calibri" w:ascii="Calibri" w:hAnsi="Calibri"/>
+          <w:lang w:val="en-CA"/>
+        </w:rPr>
+        <w:t>XML, JSON, CSS, JavaScript, PHP, HTML5. Used Bootstrap-5 and additional frameworks.</w:t>
+      </w:r>
+    </w:p>
+    <w:p>
+      <w:pPr>
+        <w:pStyle w:val="Normal"/>
+        <w:numPr>
+          <w:ilvl w:val="0"/>
+          <w:numId w:val="2"/>
+        </w:numPr>
+        <w:tabs>
+          <w:tab w:val="clear" w:pos="9360"/>
+        </w:tabs>
+        <w:spacing w:before="0" w:after="0"/>
+        <w:rPr>
+          <w:rFonts w:ascii="Calibri" w:hAnsi="Calibri" w:cs="Calibri"/>
+          <w:lang w:val="en-CA"/>
+        </w:rPr>
+      </w:pPr>
+      <w:r>
+        <w:rPr>
+          <w:rFonts w:cs="Calibri" w:ascii="Calibri" w:hAnsi="Calibri"/>
+          <w:lang w:val="en-CA"/>
+        </w:rPr>
+        <w:t>Favorite IDE: Dreamweaver (Windows) and Wappler (Linux).</w:t>
+      </w:r>
+    </w:p>
+    <w:p>
+      <w:pPr>
+        <w:pStyle w:val="Normal"/>
+        <w:numPr>
+          <w:ilvl w:val="0"/>
+          <w:numId w:val="2"/>
+        </w:numPr>
+        <w:tabs>
+          <w:tab w:val="clear" w:pos="9360"/>
+        </w:tabs>
+        <w:spacing w:before="0" w:after="0"/>
+        <w:rPr>
+          <w:rFonts w:ascii="Calibri" w:hAnsi="Calibri" w:cs="Calibri"/>
+          <w:lang w:val="en-CA"/>
+        </w:rPr>
+      </w:pPr>
+      <w:r>
+        <w:rPr>
+          <w:rFonts w:cs="Calibri" w:ascii="Calibri" w:hAnsi="Calibri"/>
+          <w:lang w:val="en-CA"/>
+        </w:rPr>
+        <w:t>OpenSource Matomo (Formally PIWIK)</w:t>
+      </w:r>
+    </w:p>
+    <w:p>
+      <w:pPr>
+        <w:pStyle w:val="Normal"/>
+        <w:numPr>
+          <w:ilvl w:val="0"/>
+          <w:numId w:val="2"/>
+        </w:numPr>
+        <w:tabs>
+          <w:tab w:val="clear" w:pos="9360"/>
+        </w:tabs>
+        <w:spacing w:before="0" w:after="0"/>
+        <w:rPr>
+          <w:rFonts w:ascii="Calibri" w:hAnsi="Calibri" w:cs="Calibri"/>
+          <w:lang w:val="en-CA"/>
+        </w:rPr>
+      </w:pPr>
+      <w:r>
+        <w:rPr>
+          <w:rFonts w:cs="Calibri" w:ascii="Calibri" w:hAnsi="Calibri"/>
+          <w:lang w:val="en-CA"/>
+        </w:rPr>
+        <w:t>Google Analytics</w:t>
+      </w:r>
+    </w:p>
+    <w:p>
+      <w:pPr>
+        <w:pStyle w:val="Normal"/>
+        <w:numPr>
+          <w:ilvl w:val="0"/>
+          <w:numId w:val="2"/>
+        </w:numPr>
+        <w:tabs>
+          <w:tab w:val="clear" w:pos="9360"/>
+        </w:tabs>
+        <w:spacing w:before="0" w:after="0"/>
+        <w:rPr>
+          <w:rFonts w:ascii="Calibri" w:hAnsi="Calibri" w:cs="Calibri"/>
+          <w:lang w:val="en-CA"/>
+        </w:rPr>
+      </w:pPr>
+      <w:r>
+        <w:rPr>
+          <w:rFonts w:cs="Calibri" w:ascii="Calibri" w:hAnsi="Calibri"/>
+          <w:lang w:val="en-CA"/>
+        </w:rPr>
+        <w:t>Microsoft Internet Information Services (IIS)</w:t>
+      </w:r>
+    </w:p>
+    <w:p>
+      <w:pPr>
+        <w:pStyle w:val="Normal"/>
+        <w:numPr>
+          <w:ilvl w:val="0"/>
+          <w:numId w:val="2"/>
+        </w:numPr>
+        <w:tabs>
+          <w:tab w:val="clear" w:pos="9360"/>
+        </w:tabs>
+        <w:spacing w:before="0" w:after="0"/>
+        <w:rPr>
+          <w:rFonts w:ascii="Calibri" w:hAnsi="Calibri" w:cs="Calibri"/>
+          <w:lang w:val="en-CA"/>
+        </w:rPr>
+      </w:pPr>
+      <w:r>
+        <w:rPr>
+          <w:rFonts w:cs="Calibri" w:ascii="Calibri" w:hAnsi="Calibri"/>
+          <w:lang w:val="en-CA"/>
+        </w:rPr>
+        <w:t>Linux with Apache Server (for testing before going live)</w:t>
+      </w:r>
+    </w:p>
+    <w:p>
+      <w:pPr>
+        <w:pStyle w:val="Normal"/>
+        <w:numPr>
+          <w:ilvl w:val="0"/>
+          <w:numId w:val="2"/>
+        </w:numPr>
+        <w:tabs>
+          <w:tab w:val="clear" w:pos="9360"/>
+        </w:tabs>
+        <w:spacing w:before="0" w:after="0"/>
+        <w:rPr>
+          <w:rFonts w:ascii="Calibri" w:hAnsi="Calibri" w:cs="Calibri"/>
+          <w:lang w:val="en-CA"/>
+        </w:rPr>
+      </w:pPr>
+      <w:r>
+        <w:rPr>
+          <w:rFonts w:cs="Calibri" w:ascii="Calibri" w:hAnsi="Calibri"/>
+          <w:lang w:val="en-CA"/>
+        </w:rPr>
+        <w:t>Computer/Network Security: Burp, Wireshark, and Packet Tracing.</w:t>
+      </w:r>
+    </w:p>
+    <w:p>
+      <w:pPr>
+        <w:pStyle w:val="Normal"/>
+        <w:numPr>
+          <w:ilvl w:val="0"/>
+          <w:numId w:val="2"/>
+        </w:numPr>
+        <w:tabs>
+          <w:tab w:val="clear" w:pos="9360"/>
+        </w:tabs>
+        <w:spacing w:before="0" w:after="0"/>
+        <w:rPr>
+          <w:rFonts w:ascii="Calibri" w:hAnsi="Calibri" w:cs="Calibri"/>
+          <w:lang w:val="en-CA"/>
+        </w:rPr>
+      </w:pPr>
+      <w:r>
+        <w:rPr>
+          <w:rFonts w:cs="Calibri" w:ascii="Calibri" w:hAnsi="Calibri"/>
+          <w:lang w:val="en-CA"/>
+        </w:rPr>
+        <w:t>MS Office programs including advanced skills such as physics tables with Excel.</w:t>
+      </w:r>
+    </w:p>
+    <w:p>
+      <w:pPr>
+        <w:pStyle w:val="Normal"/>
+        <w:numPr>
+          <w:ilvl w:val="0"/>
+          <w:numId w:val="2"/>
+        </w:numPr>
+        <w:tabs>
+          <w:tab w:val="clear" w:pos="9360"/>
+        </w:tabs>
+        <w:spacing w:before="0" w:after="0"/>
+        <w:rPr>
+          <w:rFonts w:ascii="Calibri" w:hAnsi="Calibri" w:cs="Calibri"/>
+          <w:lang w:val="en-CA"/>
+        </w:rPr>
+      </w:pPr>
+      <w:r>
+        <w:rPr>
+          <w:rFonts w:cs="Calibri" w:ascii="Calibri" w:hAnsi="Calibri"/>
+          <w:lang w:val="en-CA"/>
+        </w:rPr>
+        <w:t>Adobe Photoshop and Premier.</w:t>
+      </w:r>
+    </w:p>
+    <w:p>
+      <w:pPr>
+        <w:pStyle w:val="Heading1"/>
+        <w:rPr>
+          <w:rFonts w:ascii="Calibri" w:hAnsi="Calibri" w:cs="Calibri"/>
+          <w:sz w:val="22"/>
+          <w:szCs w:val="22"/>
+          <w:lang w:val="en-CA"/>
+        </w:rPr>
+      </w:pPr>
+      <w:r>
+        <w:rPr>
+          <w:rFonts w:cs="Calibri" w:ascii="Calibri" w:hAnsi="Calibri"/>
+          <w:sz w:val="22"/>
+          <w:szCs w:val="22"/>
+          <w:lang w:val="en-CA"/>
+        </w:rPr>
+      </w:r>
+    </w:p>
+    <w:p>
+      <w:pPr>
+        <w:pStyle w:val="Heading1"/>
+        <w:rPr>
+          <w:rFonts w:ascii="Calibri" w:hAnsi="Calibri" w:cs="Calibri"/>
+          <w:sz w:val="22"/>
+          <w:szCs w:val="22"/>
+          <w:lang w:val="en-CA"/>
+        </w:rPr>
+      </w:pPr>
+      <w:r>
+        <w:rPr>
+          <w:rFonts w:cs="Calibri" w:ascii="Calibri" w:hAnsi="Calibri"/>
+          <w:sz w:val="22"/>
+          <w:szCs w:val="22"/>
+          <w:lang w:val="en-CA"/>
+        </w:rPr>
         <w:t>Professional Experience</w:t>
+      </w:r>
+    </w:p>
+    <w:p>
+      <w:pPr>
+        <w:pStyle w:val="Normal"/>
+        <w:rPr>
+          <w:rStyle w:val="NormalBold"/>
+          <w:rFonts w:ascii="Calibri" w:hAnsi="Calibri" w:cs="Calibri"/>
+          <w:lang w:val="en-CA"/>
+        </w:rPr>
+      </w:pPr>
+      <w:r>
+        <w:rPr>
+          <w:rFonts w:cs="Calibri" w:ascii="Calibri" w:hAnsi="Calibri"/>
+          <w:lang w:val="en-CA"/>
+        </w:rPr>
       </w:r>
     </w:p>
     <w:p>
@@ -1102,6 +834,56 @@
     </w:p>
     <w:p>
       <w:pPr>
+        <w:pStyle w:val="ListParagraph"/>
+        <w:rPr>
+          <w:rFonts w:ascii="Calibri" w:hAnsi="Calibri" w:cs="Calibri"/>
+          <w:color w:val="232323"/>
+          <w:lang w:val="en-CA"/>
+        </w:rPr>
+      </w:pPr>
+      <w:r>
+        <w:rPr>
+          <w:rFonts w:cs="Calibri" w:ascii="Calibri" w:hAnsi="Calibri"/>
+          <w:color w:val="232323"/>
+          <w:lang w:val="en-CA"/>
+        </w:rPr>
+        <w:t>Shoppers Drug Mart is leading drug store retailer providing a broad range of products and services in health, beauty and convenience. This location includes expanded services including a full grocery section.</w:t>
+      </w:r>
+    </w:p>
+    <w:p>
+      <w:pPr>
+        <w:pStyle w:val="Normal"/>
+        <w:rPr>
+          <w:rStyle w:val="NormalItalic"/>
+          <w:rFonts w:ascii="Calibri" w:hAnsi="Calibri" w:cs="Calibri"/>
+          <w:lang w:val="en-CA"/>
+        </w:rPr>
+      </w:pPr>
+      <w:r>
+        <w:rPr>
+          <w:rFonts w:cs="Calibri" w:ascii="Calibri" w:hAnsi="Calibri"/>
+          <w:lang w:val="en-CA"/>
+        </w:rPr>
+      </w:r>
+    </w:p>
+    <w:p>
+      <w:pPr>
+        <w:pStyle w:val="Normal"/>
+        <w:rPr>
+          <w:rStyle w:val="NormalItalic"/>
+          <w:rFonts w:ascii="Calibri" w:hAnsi="Calibri" w:cs="Calibri"/>
+          <w:lang w:val="en-CA"/>
+        </w:rPr>
+      </w:pPr>
+      <w:r>
+        <w:rPr>
+          <w:rFonts w:cs="Calibri" w:ascii="Calibri" w:hAnsi="Calibri"/>
+          <w:lang w:val="en-CA"/>
+        </w:rPr>
+      </w:r>
+    </w:p>
+    <w:p>
+      <w:pPr>
         <w:pStyle w:val="Normal"/>
         <w:rPr/>
       </w:pPr>
@@ -1109,26 +891,64 @@
         <w:rPr>
           <w:rStyle w:val="NormalItalic"/>
           <w:rFonts w:cs="Calibri" w:ascii="Calibri" w:hAnsi="Calibri"/>
-          <w:i/>
-          <w:lang w:val="en-CA"/>
-        </w:rPr>
-        <w:t xml:space="preserve">Evening </w:t>
+          <w:lang w:val="en-CA"/>
+        </w:rPr>
+        <w:t>Evening Supervisor</w:t>
+        <w:tab/>
       </w:r>
       <w:r>
         <w:rPr>
           <w:rStyle w:val="NormalItalic"/>
           <w:rFonts w:cs="Calibri" w:ascii="Calibri" w:hAnsi="Calibri"/>
-          <w:i/>
-          <w:lang w:val="en-CA"/>
-        </w:rPr>
-        <w:t>Supervisor</w:t>
-      </w:r>
+          <w:i w:val="false"/>
+          <w:lang w:val="en-CA"/>
+        </w:rPr>
+        <w:t xml:space="preserve">June 2020 - Present </w:t>
+      </w:r>
+    </w:p>
+    <w:p>
+      <w:pPr>
+        <w:pStyle w:val="Normal"/>
+        <w:rPr/>
+      </w:pPr>
       <w:r>
         <w:rPr>
           <w:rStyle w:val="NormalItalic"/>
           <w:rFonts w:cs="Calibri" w:ascii="Calibri" w:hAnsi="Calibri"/>
-          <w:lang w:val="en-CA"/>
-        </w:rPr>
+          <w:i w:val="false"/>
+          <w:lang w:val="en-CA"/>
+        </w:rPr>
+        <w:t xml:space="preserve">Evening supervisor; along with cashier and merchandiser roles. As a supervisor, I am responsible for merchandising and overseeing employees’ tasks to ensure store is clean, well stocked and runs smoothly. Manage customer service issues. Responsible for all closing duties including reconciling financials at closing. </w:t>
+      </w:r>
+    </w:p>
+    <w:p>
+      <w:pPr>
+        <w:pStyle w:val="Normal"/>
+        <w:rPr>
+          <w:rStyle w:val="NormalItalic"/>
+          <w:rFonts w:ascii="Calibri" w:hAnsi="Calibri" w:cs="Calibri"/>
+          <w:lang w:val="en-CA"/>
+        </w:rPr>
+      </w:pPr>
+      <w:r>
+        <w:rPr>
+          <w:rFonts w:cs="Calibri" w:ascii="Calibri" w:hAnsi="Calibri"/>
+          <w:lang w:val="en-CA"/>
+        </w:rPr>
+      </w:r>
+    </w:p>
+    <w:p>
+      <w:pPr>
+        <w:pStyle w:val="Normal"/>
+        <w:rPr/>
+      </w:pPr>
+      <w:r>
+        <w:rPr>
+          <w:rStyle w:val="NormalItalic"/>
+          <w:rFonts w:cs="Calibri" w:ascii="Calibri" w:hAnsi="Calibri"/>
+          <w:lang w:val="en-CA"/>
+        </w:rPr>
+        <w:t>Cashier &amp; Merchandiser / Pharmacy Assistant</w:t>
         <w:tab/>
       </w:r>
       <w:r>
@@ -1138,383 +958,156 @@
           <w:i w:val="false"/>
           <w:lang w:val="en-CA"/>
         </w:rPr>
-        <w:t>June</w:t>
-      </w:r>
-      <w:r>
-        <w:rPr>
-          <w:rStyle w:val="NormalItalic"/>
-          <w:rFonts w:cs="Calibri" w:ascii="Calibri" w:hAnsi="Calibri"/>
-          <w:i w:val="false"/>
-          <w:lang w:val="en-CA"/>
-        </w:rPr>
-        <w:t xml:space="preserve"> 20</w:t>
-      </w:r>
-      <w:r>
-        <w:rPr>
-          <w:rStyle w:val="NormalItalic"/>
-          <w:rFonts w:cs="Calibri" w:ascii="Calibri" w:hAnsi="Calibri"/>
-          <w:i w:val="false"/>
-          <w:lang w:val="en-CA"/>
-        </w:rPr>
-        <w:t xml:space="preserve">20 </w:t>
-      </w:r>
-      <w:r>
-        <w:rPr>
-          <w:rStyle w:val="NormalItalic"/>
-          <w:rFonts w:cs="Calibri" w:ascii="Calibri" w:hAnsi="Calibri"/>
-          <w:i w:val="false"/>
-          <w:lang w:val="en-CA"/>
-        </w:rPr>
-        <w:t xml:space="preserve">- </w:t>
-      </w:r>
-      <w:r>
-        <w:rPr>
-          <w:rStyle w:val="NormalItalic"/>
-          <w:rFonts w:cs="Calibri" w:ascii="Calibri" w:hAnsi="Calibri"/>
-          <w:i w:val="false"/>
-          <w:lang w:val="en-CA"/>
-        </w:rPr>
-        <w:t>Present</w:t>
-      </w:r>
-      <w:r>
-        <w:rPr>
-          <w:rStyle w:val="NormalItalic"/>
-          <w:rFonts w:cs="Calibri" w:ascii="Calibri" w:hAnsi="Calibri"/>
-          <w:i w:val="false"/>
-          <w:lang w:val="en-CA"/>
-        </w:rPr>
-        <w:t xml:space="preserve"> </w:t>
-      </w:r>
-    </w:p>
-    <w:p>
-      <w:pPr>
-        <w:pStyle w:val="Normal"/>
+        <w:t xml:space="preserve">May 2016 - </w:t>
+      </w:r>
+      <w:r>
+        <w:rPr>
+          <w:rFonts w:cs="Calibri" w:ascii="Calibri" w:hAnsi="Calibri"/>
+          <w:lang w:val="en-CA"/>
+        </w:rPr>
+        <w:t>June 2020</w:t>
+      </w:r>
+    </w:p>
+    <w:p>
+      <w:pPr>
+        <w:pStyle w:val="ListParagraph"/>
         <w:rPr/>
       </w:pPr>
       <w:r>
         <w:rPr>
-          <w:rStyle w:val="NormalItalic"/>
-          <w:rFonts w:cs="Calibri" w:ascii="Calibri" w:hAnsi="Calibri"/>
-          <w:i w:val="false"/>
-          <w:lang w:val="en-CA"/>
-        </w:rPr>
-        <w:t>Evening supervisor; along with cashier and merchandiser roles. As a supervisor, I merchandise and cover the breaks for front cash, cosmetics and post office. Manage customer service issues. Reconcile tills and count the safe. Responsible for facing product in aisle and closing the store.</w:t>
-      </w:r>
-    </w:p>
-    <w:p>
-      <w:pPr>
-        <w:pStyle w:val="Normal"/>
-        <w:rPr/>
-      </w:pPr>
-      <w:r>
+          <w:rFonts w:cs="Calibri" w:ascii="Calibri" w:hAnsi="Calibri"/>
+          <w:u w:val="single"/>
+          <w:lang w:val="en-CA"/>
+        </w:rPr>
+        <w:t>Key Responsibilities</w:t>
+      </w:r>
+      <w:r>
+        <w:rPr>
+          <w:rFonts w:cs="Calibri" w:ascii="Calibri" w:hAnsi="Calibri"/>
+          <w:lang w:val="en-CA"/>
+        </w:rPr>
+        <w:t>:</w:t>
+      </w:r>
+    </w:p>
+    <w:p>
+      <w:pPr>
+        <w:pStyle w:val="ListParagraph"/>
+        <w:numPr>
+          <w:ilvl w:val="0"/>
+          <w:numId w:val="4"/>
+        </w:numPr>
+        <w:spacing w:before="0" w:after="0"/>
+        <w:rPr>
+          <w:rFonts w:ascii="Calibri" w:hAnsi="Calibri" w:cs="Calibri"/>
+          <w:lang w:val="en-CA"/>
+        </w:rPr>
+      </w:pPr>
+      <w:r>
+        <w:rPr>
+          <w:rFonts w:cs="Calibri" w:ascii="Calibri" w:hAnsi="Calibri"/>
+          <w:lang w:val="en-CA"/>
+        </w:rPr>
+        <w:t>Efficiently and accurately operate cash register, OLG lottery, Load Presto Cards.</w:t>
+      </w:r>
+    </w:p>
+    <w:p>
+      <w:pPr>
+        <w:pStyle w:val="ListParagraph"/>
+        <w:numPr>
+          <w:ilvl w:val="0"/>
+          <w:numId w:val="4"/>
+        </w:numPr>
+        <w:spacing w:before="0" w:after="0"/>
+        <w:rPr>
+          <w:rFonts w:ascii="Calibri" w:hAnsi="Calibri" w:cs="Calibri"/>
+          <w:lang w:val="en-CA"/>
+        </w:rPr>
+      </w:pPr>
+      <w:r>
+        <w:rPr>
+          <w:rFonts w:cs="Calibri" w:ascii="Calibri" w:hAnsi="Calibri"/>
+          <w:lang w:val="en-CA"/>
+        </w:rPr>
+        <w:t>Promote corporate customer facing charity events and promote Shoppers Loyalty Program (Optimum).</w:t>
+      </w:r>
+    </w:p>
+    <w:p>
+      <w:pPr>
+        <w:pStyle w:val="ListParagraph"/>
+        <w:numPr>
+          <w:ilvl w:val="0"/>
+          <w:numId w:val="4"/>
+        </w:numPr>
+        <w:spacing w:before="0" w:after="0"/>
+        <w:rPr>
+          <w:rFonts w:ascii="Calibri" w:hAnsi="Calibri" w:cs="Calibri"/>
+          <w:lang w:val="en-CA"/>
+        </w:rPr>
+      </w:pPr>
+      <w:r>
+        <w:rPr>
+          <w:rFonts w:cs="Calibri" w:ascii="Calibri" w:hAnsi="Calibri"/>
+          <w:lang w:val="en-CA"/>
+        </w:rPr>
+        <w:t>Perform merchandising tasks such as: maintaining a temperature log, checking expiry dates, using a PDT (to print price tags, bin excess inventory, check prices and, check planogram when restocking.</w:t>
+      </w:r>
+    </w:p>
+    <w:p>
+      <w:pPr>
+        <w:pStyle w:val="ListParagraph"/>
+        <w:numPr>
+          <w:ilvl w:val="0"/>
+          <w:numId w:val="4"/>
+        </w:numPr>
+        <w:spacing w:before="0" w:after="0"/>
+        <w:rPr>
+          <w:rFonts w:ascii="Calibri" w:hAnsi="Calibri" w:cs="Calibri"/>
+          <w:lang w:val="en-CA"/>
+        </w:rPr>
+      </w:pPr>
+      <w:r>
+        <w:rPr>
+          <w:rFonts w:cs="Calibri" w:ascii="Calibri" w:hAnsi="Calibri"/>
+          <w:lang w:val="en-CA"/>
+        </w:rPr>
+        <w:t>Assist in pharmacy at cash, preparing delivery orders including payment. Calling customers when their prescriptions are ready for pickup. Sort prepared prescriptions and, recently received drugs. Sign-up customers for the online pharmacy. Staffing has improved in pharmacy since COVID-19.</w:t>
+      </w:r>
+    </w:p>
+    <w:p>
+      <w:pPr>
+        <w:pStyle w:val="ListParagraph"/>
+        <w:numPr>
+          <w:ilvl w:val="0"/>
+          <w:numId w:val="4"/>
+        </w:numPr>
+        <w:spacing w:before="0" w:after="0"/>
+        <w:rPr>
+          <w:rFonts w:ascii="Calibri" w:hAnsi="Calibri" w:cs="Calibri"/>
+          <w:lang w:val="en-CA"/>
+        </w:rPr>
+      </w:pPr>
+      <w:r>
+        <w:rPr>
+          <w:rFonts w:cs="Calibri" w:ascii="Calibri" w:hAnsi="Calibri"/>
+          <w:lang w:val="en-CA"/>
+        </w:rPr>
+        <w:t>During COVID-19 pandemic, regularly wear a face shield and/or mask at work. Enforce Ottawa mask wearing bylaw at work, asking customers to wear a mask; covering nose and mouth. Protects myself and the others around me.</w:t>
+      </w:r>
+    </w:p>
+    <w:p>
+      <w:pPr>
+        <w:pStyle w:val="Normal"/>
         <w:rPr>
           <w:rStyle w:val="NormalBold"/>
-          <w:rFonts w:cs="Calibri" w:ascii="Calibri" w:hAnsi="Calibri"/>
-          <w:lang w:val="en-CA"/>
-        </w:rPr>
-        <w:t>Shoppers Drug Mart</w:t>
-      </w:r>
-      <w:r>
-        <w:rPr>
-          <w:rFonts w:cs="Calibri" w:ascii="Calibri" w:hAnsi="Calibri"/>
-          <w:lang w:val="en-CA"/>
-        </w:rPr>
-        <w:tab/>
-        <w:t>Ottawa, ON, Canada</w:t>
-      </w:r>
-    </w:p>
-    <w:p>
-      <w:pPr>
-        <w:pStyle w:val="Normal"/>
-        <w:rPr/>
-      </w:pPr>
-      <w:r>
-        <w:rPr>
-          <w:rStyle w:val="NormalItalic"/>
-          <w:rFonts w:cs="Calibri" w:ascii="Calibri" w:hAnsi="Calibri"/>
-          <w:lang w:val="en-CA"/>
-        </w:rPr>
-        <w:t xml:space="preserve">Cashier &amp; Merchandiser </w:t>
-      </w:r>
-      <w:r>
-        <w:rPr>
-          <w:rStyle w:val="NormalItalic"/>
-          <w:rFonts w:cs="Calibri" w:ascii="Calibri" w:hAnsi="Calibri"/>
-          <w:lang w:val="en-CA"/>
-        </w:rPr>
-        <w:t>(also assist in pharmacy)</w:t>
-      </w:r>
-      <w:r>
-        <w:rPr>
-          <w:rStyle w:val="NormalItalic"/>
-          <w:rFonts w:cs="Calibri" w:ascii="Calibri" w:hAnsi="Calibri"/>
-          <w:lang w:val="en-CA"/>
-        </w:rPr>
-        <w:tab/>
-      </w:r>
-      <w:r>
-        <w:rPr>
-          <w:rStyle w:val="NormalItalic"/>
-          <w:rFonts w:cs="Calibri" w:ascii="Calibri" w:hAnsi="Calibri"/>
-          <w:i w:val="false"/>
-          <w:lang w:val="en-CA"/>
-        </w:rPr>
-        <w:t xml:space="preserve">May 2016 - </w:t>
-      </w:r>
-      <w:r>
-        <w:rPr>
-          <w:rFonts w:cs="Calibri" w:ascii="Calibri" w:hAnsi="Calibri"/>
-          <w:lang w:val="en-CA"/>
-        </w:rPr>
-        <w:t>June 2020</w:t>
-      </w:r>
-    </w:p>
-    <w:p>
-      <w:pPr>
-        <w:pStyle w:val="ListParagraph"/>
-        <w:widowControl/>
-        <w:ind w:left="0" w:right="0" w:hanging="0"/>
-        <w:rPr>
-          <w:rFonts w:ascii="Helvetica;Arial;sans-serif" w:hAnsi="Helvetica;Arial;sans-serif"/>
-          <w:u w:val="none"/>
-        </w:rPr>
-      </w:pPr>
-      <w:r>
-        <w:rPr>
-          <w:rFonts w:cs="Calibri" w:ascii="Calibri" w:hAnsi="Calibri"/>
-          <w:b w:val="false"/>
-          <w:i w:val="false"/>
-          <w:caps w:val="false"/>
-          <w:smallCaps w:val="false"/>
-          <w:color w:val="232323"/>
-          <w:spacing w:val="0"/>
-          <w:sz w:val="22"/>
-          <w:szCs w:val="22"/>
-          <w:u w:val="none"/>
-          <w:lang w:val="en-CA"/>
-        </w:rPr>
-        <w:t xml:space="preserve">Shoppers Drug Mart is leading drug store retailer providing a broad range of products and services in health, beauty and convenience. Our location is open till midnight. </w:t>
-      </w:r>
-      <w:r>
-        <w:rPr>
-          <w:rFonts w:cs="Calibri" w:ascii="Calibri" w:hAnsi="Calibri"/>
-          <w:b w:val="false"/>
-          <w:i w:val="false"/>
-          <w:caps w:val="false"/>
-          <w:smallCaps w:val="false"/>
-          <w:color w:val="232323"/>
-          <w:spacing w:val="0"/>
-          <w:sz w:val="22"/>
-          <w:szCs w:val="22"/>
-          <w:u w:val="none"/>
-          <w:lang w:val="en-CA"/>
-        </w:rPr>
-        <w:t>Our location r</w:t>
-      </w:r>
-      <w:r>
-        <w:rPr>
-          <w:rFonts w:cs="Calibri" w:ascii="Calibri" w:hAnsi="Calibri"/>
-          <w:b w:val="false"/>
-          <w:i w:val="false"/>
-          <w:caps w:val="false"/>
-          <w:smallCaps w:val="false"/>
-          <w:color w:val="232323"/>
-          <w:spacing w:val="0"/>
-          <w:sz w:val="22"/>
-          <w:szCs w:val="22"/>
-          <w:u w:val="none"/>
-          <w:lang w:val="en-CA"/>
-        </w:rPr>
-        <w:t>ecently expanded the grocery section, providing fresh produce, easy meals and self checkouts.</w:t>
-      </w:r>
-    </w:p>
-    <w:p>
-      <w:pPr>
-        <w:pStyle w:val="ListParagraph"/>
-        <w:widowControl/>
-        <w:ind w:left="0" w:right="0" w:hanging="0"/>
-        <w:rPr>
-          <w:rFonts w:ascii="Calibri" w:hAnsi="Calibri" w:cs="Calibri"/>
-          <w:b w:val="false"/>
-          <w:i w:val="false"/>
-          <w:caps w:val="false"/>
-          <w:smallCaps w:val="false"/>
-          <w:color w:val="232323"/>
-          <w:spacing w:val="0"/>
-          <w:sz w:val="22"/>
-          <w:szCs w:val="22"/>
-          <w:u w:val="none"/>
-          <w:lang w:val="en-CA"/>
-        </w:rPr>
-      </w:pPr>
-      <w:r>
-        <w:rPr>
-          <w:rFonts w:cs="Calibri" w:ascii="Calibri" w:hAnsi="Calibri"/>
-          <w:b w:val="false"/>
-          <w:i w:val="false"/>
-          <w:caps w:val="false"/>
-          <w:smallCaps w:val="false"/>
-          <w:color w:val="232323"/>
-          <w:spacing w:val="0"/>
-          <w:sz w:val="22"/>
-          <w:szCs w:val="22"/>
-          <w:u w:val="none"/>
-          <w:lang w:val="en-CA"/>
-        </w:rPr>
-      </w:r>
-    </w:p>
-    <w:p>
-      <w:pPr>
-        <w:pStyle w:val="ListParagraph"/>
-        <w:rPr/>
-      </w:pPr>
-      <w:r>
-        <w:rPr>
-          <w:rFonts w:cs="Calibri" w:ascii="Calibri" w:hAnsi="Calibri"/>
-          <w:u w:val="single"/>
-          <w:lang w:val="en-CA"/>
-        </w:rPr>
-        <w:t>Key Responsibilities</w:t>
-      </w:r>
-      <w:r>
-        <w:rPr>
-          <w:rFonts w:cs="Calibri" w:ascii="Calibri" w:hAnsi="Calibri"/>
-          <w:lang w:val="en-CA"/>
-        </w:rPr>
-        <w:t>:</w:t>
-      </w:r>
-    </w:p>
-    <w:p>
-      <w:pPr>
-        <w:pStyle w:val="ListParagraph"/>
-        <w:numPr>
-          <w:ilvl w:val="0"/>
-          <w:numId w:val="4"/>
-        </w:numPr>
-        <w:spacing w:before="0" w:after="0"/>
-        <w:rPr>
-          <w:rFonts w:ascii="Calibri" w:hAnsi="Calibri" w:cs="Calibri"/>
-          <w:lang w:val="en-CA"/>
-        </w:rPr>
-      </w:pPr>
-      <w:r>
-        <w:rPr>
-          <w:rFonts w:cs="Calibri" w:ascii="Calibri" w:hAnsi="Calibri"/>
-          <w:lang w:val="en-CA"/>
-        </w:rPr>
-        <w:t>Efficiently and accurately operate cash register, OLG lottery, Load Presto Cards.</w:t>
-      </w:r>
-    </w:p>
-    <w:p>
-      <w:pPr>
-        <w:pStyle w:val="ListParagraph"/>
-        <w:numPr>
-          <w:ilvl w:val="0"/>
-          <w:numId w:val="4"/>
-        </w:numPr>
-        <w:spacing w:before="0" w:after="0"/>
-        <w:rPr>
-          <w:rFonts w:ascii="Calibri" w:hAnsi="Calibri" w:cs="Calibri"/>
-          <w:lang w:val="en-CA"/>
-        </w:rPr>
-      </w:pPr>
-      <w:r>
-        <w:rPr>
-          <w:rFonts w:cs="Calibri" w:ascii="Calibri" w:hAnsi="Calibri"/>
-          <w:lang w:val="en-CA"/>
-        </w:rPr>
-        <w:t>Promote corporate customer facing charity events and promote Shoppers Loyalty Program (Optimum).</w:t>
-      </w:r>
-    </w:p>
-    <w:p>
-      <w:pPr>
-        <w:pStyle w:val="ListParagraph"/>
-        <w:numPr>
-          <w:ilvl w:val="0"/>
-          <w:numId w:val="4"/>
-        </w:numPr>
-        <w:spacing w:before="0" w:after="0"/>
-        <w:rPr>
-          <w:rFonts w:ascii="Calibri" w:hAnsi="Calibri" w:cs="Calibri"/>
-          <w:lang w:val="en-CA"/>
-        </w:rPr>
-      </w:pPr>
-      <w:r>
-        <w:rPr>
-          <w:rFonts w:cs="Calibri" w:ascii="Calibri" w:hAnsi="Calibri"/>
-          <w:lang w:val="en-CA"/>
-        </w:rPr>
-        <w:t>Perform merchandising tasks such as: maintaining a temperature log, checking expiry dates, using a PDT (to print price tags, bin excess inventory, check prices and, check planogram when restocking.</w:t>
-      </w:r>
-    </w:p>
-    <w:p>
-      <w:pPr>
-        <w:pStyle w:val="ListParagraph"/>
-        <w:numPr>
-          <w:ilvl w:val="0"/>
-          <w:numId w:val="4"/>
-        </w:numPr>
-        <w:spacing w:before="0" w:after="0"/>
-        <w:rPr>
-          <w:rFonts w:ascii="Calibri" w:hAnsi="Calibri" w:cs="Calibri"/>
-          <w:lang w:val="en-CA"/>
-        </w:rPr>
-      </w:pPr>
-      <w:r>
-        <w:rPr>
-          <w:rFonts w:cs="Calibri" w:ascii="Calibri" w:hAnsi="Calibri"/>
-          <w:lang w:val="en-CA"/>
-        </w:rPr>
-        <w:t>Assist in pharmacy at cash, preparing delivery orders including payment. Calling customers when their prescriptions are ready for pickup. Sort prepared prescriptions and, recently received drugs. Sign-up customers for the online pharmacy. Staffing has improved in pharmacy since COVID-19.</w:t>
-      </w:r>
-    </w:p>
-    <w:p>
-      <w:pPr>
-        <w:pStyle w:val="ListParagraph"/>
-        <w:numPr>
-          <w:ilvl w:val="0"/>
-          <w:numId w:val="4"/>
-        </w:numPr>
-        <w:spacing w:before="0" w:after="0"/>
-        <w:rPr>
-          <w:rFonts w:ascii="Calibri" w:hAnsi="Calibri" w:cs="Calibri"/>
-          <w:lang w:val="en-CA"/>
-        </w:rPr>
-      </w:pPr>
-      <w:r>
-        <w:rPr>
-          <w:rFonts w:cs="Calibri" w:ascii="Calibri" w:hAnsi="Calibri"/>
-          <w:lang w:val="en-CA"/>
-        </w:rPr>
-        <w:t>During COVID-19 pandemic, regularly wear a face shield and/</w:t>
-      </w:r>
-      <w:r>
-        <w:rPr>
-          <w:rFonts w:cs="Calibri" w:ascii="Calibri" w:hAnsi="Calibri"/>
-          <w:lang w:val="en-CA"/>
-        </w:rPr>
-        <w:t>or</w:t>
-      </w:r>
-      <w:r>
-        <w:rPr>
-          <w:rFonts w:cs="Calibri" w:ascii="Calibri" w:hAnsi="Calibri"/>
-          <w:lang w:val="en-CA"/>
-        </w:rPr>
-        <w:t xml:space="preserve"> mask at work. </w:t>
-      </w:r>
-      <w:r>
-        <w:rPr>
-          <w:rFonts w:cs="Calibri" w:ascii="Calibri" w:hAnsi="Calibri"/>
-          <w:lang w:val="en-CA"/>
-        </w:rPr>
-        <w:t>Enforce Ottawa mask wearing bylaw at work, asking customers to wear a mask; covering nose and mouth.</w:t>
-      </w:r>
-      <w:r>
-        <w:rPr>
-          <w:rFonts w:cs="Calibri" w:ascii="Calibri" w:hAnsi="Calibri"/>
-          <w:lang w:val="en-CA"/>
-        </w:rPr>
-        <w:t xml:space="preserve"> Protects myself and the others around me.</w:t>
+          <w:rFonts w:ascii="Calibri" w:hAnsi="Calibri" w:cs="Calibri"/>
+          <w:lang w:val="en-CA"/>
+        </w:rPr>
+      </w:pPr>
+      <w:r>
+        <w:rPr>
+          <w:rFonts w:cs="Calibri" w:ascii="Calibri" w:hAnsi="Calibri"/>
+          <w:lang w:val="en-CA"/>
+        </w:rPr>
       </w:r>
     </w:p>
     <w:p>
@@ -1541,6 +1134,38 @@
     </w:p>
     <w:p>
       <w:pPr>
+        <w:pStyle w:val="ListParagraph"/>
+        <w:rPr>
+          <w:rFonts w:ascii="Calibri" w:hAnsi="Calibri" w:cs="Calibri"/>
+          <w:lang w:val="en-CA"/>
+        </w:rPr>
+      </w:pPr>
+      <w:r>
+        <w:rPr>
+          <w:rFonts w:cs="Calibri" w:ascii="Calibri" w:hAnsi="Calibri"/>
+          <w:lang w:val="en-CA"/>
+        </w:rPr>
+        <w:t>I-AM Retailer Solutions specializes in advanced retail display solutions, featuring video and mobile advertising capabilities.</w:t>
+      </w:r>
+    </w:p>
+    <w:p>
+      <w:pPr>
+        <w:pStyle w:val="Normal"/>
+        <w:rPr>
+          <w:rStyle w:val="NormalItalic"/>
+          <w:rFonts w:ascii="Calibri" w:hAnsi="Calibri" w:cs="Calibri"/>
+          <w:lang w:val="en-CA"/>
+        </w:rPr>
+      </w:pPr>
+      <w:r>
+        <w:rPr>
+          <w:rFonts w:cs="Calibri" w:ascii="Calibri" w:hAnsi="Calibri"/>
+          <w:lang w:val="en-CA"/>
+        </w:rPr>
+      </w:r>
+    </w:p>
+    <w:p>
+      <w:pPr>
         <w:pStyle w:val="Normal"/>
         <w:rPr/>
       </w:pPr>
@@ -1566,22 +1191,6 @@
         <w:pStyle w:val="ListParagraph"/>
         <w:rPr>
           <w:rFonts w:ascii="Calibri" w:hAnsi="Calibri" w:cs="Calibri"/>
-          <w:lang w:val="en-CA"/>
-        </w:rPr>
-      </w:pPr>
-      <w:r>
-        <w:rPr>
-          <w:rFonts w:cs="Calibri" w:ascii="Calibri" w:hAnsi="Calibri"/>
-          <w:lang w:val="en-CA"/>
-        </w:rPr>
-        <w:t>I-AM Retailer Solutions specializes in advanced retail display solutions, featuring video and mobile advertising capabilities.</w:t>
-      </w:r>
-    </w:p>
-    <w:p>
-      <w:pPr>
-        <w:pStyle w:val="ListParagraph"/>
-        <w:rPr>
-          <w:rFonts w:ascii="Calibri" w:hAnsi="Calibri" w:cs="Calibri"/>
           <w:u w:val="single"/>
           <w:lang w:val="en-CA"/>
         </w:rPr>
@@ -1592,23 +1201,7 @@
           <w:u w:val="single"/>
           <w:lang w:val="en-CA"/>
         </w:rPr>
-        <w:t>Assignments and Project</w:t>
-      </w:r>
-      <w:r>
-        <w:rPr>
-          <w:rFonts w:cs="Calibri" w:ascii="Calibri" w:hAnsi="Calibri"/>
-          <w:u w:val="single"/>
-          <w:lang w:val="en-CA"/>
-        </w:rPr>
-        <w:t>s</w:t>
-      </w:r>
-      <w:r>
-        <w:rPr>
-          <w:rFonts w:cs="Calibri" w:ascii="Calibri" w:hAnsi="Calibri"/>
-          <w:u w:val="single"/>
-          <w:lang w:val="en-CA"/>
-        </w:rPr>
-        <w:t xml:space="preserve"> completed:</w:t>
+        <w:t>Assignments and Projects completed:</w:t>
       </w:r>
     </w:p>
     <w:p>
@@ -1801,6 +1394,54 @@
           <w:lang w:val="en-CA"/>
         </w:rPr>
         <w:t xml:space="preserve">Installed Linux (Ubuntu) and ran advertising on the Digital Engines that run the I-AM  video screens and connected them to a gateway which had always-on cellular internet service. </w:t>
+      </w:r>
+    </w:p>
+    <w:p>
+      <w:pPr>
+        <w:pStyle w:val="Normal"/>
+        <w:rPr>
+          <w:rStyle w:val="NormalBold"/>
+          <w:rFonts w:ascii="Calibri" w:hAnsi="Calibri" w:cs="Calibri"/>
+          <w:lang w:val="en-CA"/>
+        </w:rPr>
+      </w:pPr>
+      <w:r>
+        <w:rPr>
+          <w:rFonts w:cs="Calibri" w:ascii="Calibri" w:hAnsi="Calibri"/>
+          <w:lang w:val="en-CA"/>
+        </w:rPr>
+      </w:r>
+    </w:p>
+    <w:p>
+      <w:pPr>
+        <w:pStyle w:val="Normal"/>
+        <w:rPr>
+          <w:rStyle w:val="NormalBold"/>
+          <w:rFonts w:ascii="Calibri" w:hAnsi="Calibri" w:cs="Calibri"/>
+          <w:lang w:val="en-CA"/>
+        </w:rPr>
+      </w:pPr>
+      <w:r>
+        <w:rPr>
+          <w:rFonts w:cs="Calibri" w:ascii="Calibri" w:hAnsi="Calibri"/>
+          <w:lang w:val="en-CA"/>
+        </w:rPr>
+      </w:r>
+    </w:p>
+    <w:p>
+      <w:pPr>
+        <w:pStyle w:val="Normal"/>
+        <w:rPr>
+          <w:rStyle w:val="NormalBold"/>
+          <w:rFonts w:ascii="Calibri" w:hAnsi="Calibri" w:cs="Calibri"/>
+          <w:lang w:val="en-CA"/>
+        </w:rPr>
+      </w:pPr>
+      <w:r>
+        <w:rPr>
+          <w:rFonts w:cs="Calibri" w:ascii="Calibri" w:hAnsi="Calibri"/>
+          <w:lang w:val="en-CA"/>
+        </w:rPr>
       </w:r>
     </w:p>
     <w:p>
@@ -1827,6 +1468,38 @@
     </w:p>
     <w:p>
       <w:pPr>
+        <w:pStyle w:val="ListParagraph"/>
+        <w:rPr>
+          <w:rFonts w:ascii="Calibri" w:hAnsi="Calibri" w:cs="Calibri"/>
+          <w:lang w:val="en-CA"/>
+        </w:rPr>
+      </w:pPr>
+      <w:r>
+        <w:rPr>
+          <w:rFonts w:cs="Calibri" w:ascii="Calibri" w:hAnsi="Calibri"/>
+          <w:lang w:val="en-CA"/>
+        </w:rPr>
+        <w:t xml:space="preserve">Dominion Voting Systems (“DVS”) began in 1895 in New York with the invention of the first ever Direct Recording lever machines for elections. DVS is still known for its innovation in election technology. </w:t>
+      </w:r>
+    </w:p>
+    <w:p>
+      <w:pPr>
+        <w:pStyle w:val="Normal"/>
+        <w:rPr>
+          <w:rStyle w:val="NormalItalic"/>
+          <w:rFonts w:ascii="Calibri" w:hAnsi="Calibri" w:cs="Calibri"/>
+          <w:lang w:val="en-CA"/>
+        </w:rPr>
+      </w:pPr>
+      <w:r>
+        <w:rPr>
+          <w:rFonts w:cs="Calibri" w:ascii="Calibri" w:hAnsi="Calibri"/>
+          <w:lang w:val="en-CA"/>
+        </w:rPr>
+      </w:r>
+    </w:p>
+    <w:p>
+      <w:pPr>
         <w:pStyle w:val="Normal"/>
         <w:rPr/>
       </w:pPr>
@@ -1849,6 +1522,106 @@
     </w:p>
     <w:p>
       <w:pPr>
+        <w:pStyle w:val="ListParagraph"/>
+        <w:rPr/>
+      </w:pPr>
+      <w:r>
+        <w:rPr>
+          <w:rFonts w:cs="Calibri" w:ascii="Calibri" w:hAnsi="Calibri"/>
+          <w:u w:val="single"/>
+          <w:lang w:val="en-CA"/>
+        </w:rPr>
+        <w:t>Key Responsibilities</w:t>
+      </w:r>
+      <w:r>
+        <w:rPr>
+          <w:rFonts w:cs="Calibri" w:ascii="Calibri" w:hAnsi="Calibri"/>
+          <w:lang w:val="en-CA"/>
+        </w:rPr>
+        <w:t>:</w:t>
+      </w:r>
+    </w:p>
+    <w:p>
+      <w:pPr>
+        <w:pStyle w:val="ListParagraph"/>
+        <w:numPr>
+          <w:ilvl w:val="0"/>
+          <w:numId w:val="5"/>
+        </w:numPr>
+        <w:spacing w:before="0" w:after="0"/>
+        <w:rPr>
+          <w:rFonts w:ascii="Calibri" w:hAnsi="Calibri" w:cs="Calibri"/>
+          <w:lang w:val="en-CA"/>
+        </w:rPr>
+      </w:pPr>
+      <w:r>
+        <w:rPr>
+          <w:rFonts w:cs="Calibri" w:ascii="Calibri" w:hAnsi="Calibri"/>
+          <w:lang w:val="en-CA"/>
+        </w:rPr>
+        <w:t>Provided advanced training for the 2018 Ontario Election to all Poll Officials in Ottawa.</w:t>
+      </w:r>
+    </w:p>
+    <w:p>
+      <w:pPr>
+        <w:pStyle w:val="ListParagraph"/>
+        <w:numPr>
+          <w:ilvl w:val="0"/>
+          <w:numId w:val="5"/>
+        </w:numPr>
+        <w:spacing w:before="0" w:after="0"/>
+        <w:rPr>
+          <w:rFonts w:ascii="Calibri" w:hAnsi="Calibri" w:cs="Calibri"/>
+          <w:lang w:val="en-CA"/>
+        </w:rPr>
+      </w:pPr>
+      <w:r>
+        <w:rPr>
+          <w:rFonts w:cs="Calibri" w:ascii="Calibri" w:hAnsi="Calibri"/>
+          <w:lang w:val="en-CA"/>
+        </w:rPr>
+        <w:t>Assisted with equipment setup and conducted Logic &amp; Accuracy testing.</w:t>
+      </w:r>
+    </w:p>
+    <w:p>
+      <w:pPr>
+        <w:pStyle w:val="ListParagraph"/>
+        <w:numPr>
+          <w:ilvl w:val="0"/>
+          <w:numId w:val="5"/>
+        </w:numPr>
+        <w:spacing w:before="0" w:after="0"/>
+        <w:rPr>
+          <w:rFonts w:ascii="Calibri" w:hAnsi="Calibri" w:cs="Calibri"/>
+          <w:lang w:val="en-CA"/>
+        </w:rPr>
+      </w:pPr>
+      <w:r>
+        <w:rPr>
+          <w:rFonts w:cs="Calibri" w:ascii="Calibri" w:hAnsi="Calibri"/>
+          <w:lang w:val="en-CA"/>
+        </w:rPr>
+        <w:t>Provided support during polling hours and while votes were being tabulated.</w:t>
+      </w:r>
+    </w:p>
+    <w:p>
+      <w:pPr>
+        <w:pStyle w:val="Normal"/>
+        <w:rPr>
+          <w:rStyle w:val="NormalItalic"/>
+          <w:rFonts w:ascii="Calibri" w:hAnsi="Calibri" w:cs="Calibri"/>
+          <w:lang w:val="en-CA"/>
+        </w:rPr>
+      </w:pPr>
+      <w:r>
+        <w:rPr>
+          <w:rFonts w:cs="Calibri" w:ascii="Calibri" w:hAnsi="Calibri"/>
+          <w:lang w:val="en-CA"/>
+        </w:rPr>
+      </w:r>
+    </w:p>
+    <w:p>
+      <w:pPr>
         <w:pStyle w:val="Normal"/>
         <w:rPr/>
       </w:pPr>
@@ -1871,55 +1644,20 @@
     </w:p>
     <w:p>
       <w:pPr>
-        <w:pStyle w:val="ListParagraph"/>
-        <w:rPr>
-          <w:rFonts w:ascii="Calibri" w:hAnsi="Calibri" w:cs="Calibri"/>
-          <w:lang w:val="en-CA"/>
-        </w:rPr>
-      </w:pPr>
-      <w:r>
-        <w:rPr>
-          <w:rFonts w:cs="Calibri" w:ascii="Calibri" w:hAnsi="Calibri"/>
-          <w:lang w:val="en-CA"/>
-        </w:rPr>
-        <w:t xml:space="preserve">Dominion Voting Systems (“DVS”) began in 1895 in New York with the invention of the first ever Direct Recording lever machines for elections. DVS is still known for its innovation in election technology. </w:t>
-      </w:r>
-    </w:p>
-    <w:p>
-      <w:pPr>
-        <w:pStyle w:val="ListParagraph"/>
-        <w:rPr/>
-      </w:pPr>
-      <w:r>
-        <w:rPr>
-          <w:rFonts w:cs="Calibri" w:ascii="Calibri" w:hAnsi="Calibri"/>
+        <w:pStyle w:val="Normal"/>
+        <w:rPr>
+          <w:rFonts w:ascii="Calibri" w:hAnsi="Calibri" w:cs="Calibri"/>
           <w:u w:val="single"/>
           <w:lang w:val="en-CA"/>
         </w:rPr>
-        <w:t>Key Responsibilities</w:t>
-      </w:r>
-      <w:r>
-        <w:rPr>
-          <w:rFonts w:cs="Calibri" w:ascii="Calibri" w:hAnsi="Calibri"/>
-          <w:lang w:val="en-CA"/>
-        </w:rPr>
-        <w:t>:</w:t>
-      </w:r>
-    </w:p>
-    <w:p>
-      <w:pPr>
-        <w:pStyle w:val="ListParagraph"/>
-        <w:rPr>
-          <w:rFonts w:ascii="Calibri" w:hAnsi="Calibri" w:cs="Calibri"/>
-          <w:lang w:val="en-CA"/>
-        </w:rPr>
-      </w:pPr>
-      <w:r>
-        <w:rPr>
-          <w:rFonts w:cs="Calibri" w:ascii="Calibri" w:hAnsi="Calibri"/>
-          <w:lang w:val="en-CA"/>
-        </w:rPr>
-        <w:t xml:space="preserve">2018: </w:t>
+      </w:pPr>
+      <w:r>
+        <w:rPr>
+          <w:rFonts w:cs="Calibri" w:ascii="Calibri" w:hAnsi="Calibri"/>
+          <w:u w:val="single"/>
+          <w:lang w:val="en-CA"/>
+        </w:rPr>
+        <w:t>Key Responsibilities:</w:t>
       </w:r>
     </w:p>
     <w:p>
@@ -1940,7 +1678,7 @@
           <w:rFonts w:cs="Calibri" w:ascii="Calibri" w:hAnsi="Calibri"/>
           <w:lang w:val="en-CA"/>
         </w:rPr>
-        <w:t>Provided advanced training for the 2018 Ontario Election to all Poll Officials in Ottawa.</w:t>
+        <w:t>Assisted Tabulator District Returning Officers (“TDROs”) with equipment to set-up.</w:t>
       </w:r>
     </w:p>
     <w:p>
@@ -1961,7 +1699,7 @@
           <w:rFonts w:cs="Calibri" w:ascii="Calibri" w:hAnsi="Calibri"/>
           <w:lang w:val="en-CA"/>
         </w:rPr>
-        <w:t>Assisted with equipment setup and conducted Logic &amp; Accuracy testing.</w:t>
+        <w:t>Assisted TDRO with Logic and Accuracy testing of DVS electronic voting equipment.</w:t>
       </w:r>
     </w:p>
     <w:p>
@@ -1982,116 +1720,23 @@
           <w:rFonts w:cs="Calibri" w:ascii="Calibri" w:hAnsi="Calibri"/>
           <w:lang w:val="en-CA"/>
         </w:rPr>
-        <w:t>Provided support during polling hours and while votes were being tabulated.</w:t>
-      </w:r>
-    </w:p>
-    <w:p>
-      <w:pPr>
-        <w:pStyle w:val="ListParagraph"/>
-        <w:rPr>
-          <w:rFonts w:ascii="Calibri" w:hAnsi="Calibri" w:cs="Calibri"/>
-          <w:lang w:val="en-CA"/>
-        </w:rPr>
-      </w:pPr>
-      <w:r>
-        <w:rPr>
-          <w:rFonts w:cs="Calibri" w:ascii="Calibri" w:hAnsi="Calibri"/>
-          <w:lang w:val="en-CA"/>
-        </w:rPr>
-      </w:r>
-    </w:p>
-    <w:p>
-      <w:pPr>
-        <w:pStyle w:val="ListParagraph"/>
-        <w:rPr>
-          <w:rFonts w:ascii="Calibri" w:hAnsi="Calibri" w:cs="Calibri"/>
-          <w:lang w:val="en-CA"/>
-        </w:rPr>
-      </w:pPr>
-      <w:r>
-        <w:rPr>
-          <w:rFonts w:cs="Calibri" w:ascii="Calibri" w:hAnsi="Calibri"/>
-          <w:lang w:val="en-CA"/>
-        </w:rPr>
-      </w:r>
-    </w:p>
-    <w:p>
-      <w:pPr>
-        <w:pStyle w:val="ListParagraph"/>
-        <w:rPr>
-          <w:rFonts w:ascii="Calibri" w:hAnsi="Calibri" w:cs="Calibri"/>
-          <w:lang w:val="en-CA"/>
-        </w:rPr>
-      </w:pPr>
-      <w:r>
-        <w:rPr>
-          <w:rFonts w:cs="Calibri" w:ascii="Calibri" w:hAnsi="Calibri"/>
-          <w:lang w:val="en-CA"/>
-        </w:rPr>
-        <w:t>2014:</w:t>
-      </w:r>
-    </w:p>
-    <w:p>
-      <w:pPr>
-        <w:pStyle w:val="ListParagraph"/>
-        <w:numPr>
-          <w:ilvl w:val="0"/>
-          <w:numId w:val="5"/>
-        </w:numPr>
-        <w:spacing w:before="0" w:after="0"/>
-        <w:rPr>
-          <w:rFonts w:ascii="Calibri" w:hAnsi="Calibri" w:cs="Calibri"/>
-          <w:lang w:val="en-CA"/>
-        </w:rPr>
-      </w:pPr>
-      <w:r>
-        <w:rPr>
-          <w:rFonts w:cs="Calibri" w:ascii="Calibri" w:hAnsi="Calibri"/>
-          <w:lang w:val="en-CA"/>
-        </w:rPr>
-        <w:t>Assisted Tabulator District Returning Officers (“TDROs”) with equipment to set-up.</w:t>
-      </w:r>
-    </w:p>
-    <w:p>
-      <w:pPr>
-        <w:pStyle w:val="ListParagraph"/>
-        <w:numPr>
-          <w:ilvl w:val="0"/>
-          <w:numId w:val="5"/>
-        </w:numPr>
-        <w:spacing w:before="0" w:after="0"/>
-        <w:rPr>
-          <w:rFonts w:ascii="Calibri" w:hAnsi="Calibri" w:cs="Calibri"/>
-          <w:lang w:val="en-CA"/>
-        </w:rPr>
-      </w:pPr>
-      <w:r>
-        <w:rPr>
-          <w:rFonts w:cs="Calibri" w:ascii="Calibri" w:hAnsi="Calibri"/>
-          <w:lang w:val="en-CA"/>
-        </w:rPr>
-        <w:t>Assisted TDRO with Logic and Accuracy testing of DVS electronic voting equipment.</w:t>
-      </w:r>
-    </w:p>
-    <w:p>
-      <w:pPr>
-        <w:pStyle w:val="ListParagraph"/>
-        <w:numPr>
-          <w:ilvl w:val="0"/>
-          <w:numId w:val="5"/>
-        </w:numPr>
-        <w:spacing w:before="0" w:after="0"/>
-        <w:rPr>
-          <w:rFonts w:ascii="Calibri" w:hAnsi="Calibri" w:cs="Calibri"/>
-          <w:lang w:val="en-CA"/>
-        </w:rPr>
-      </w:pPr>
-      <w:r>
-        <w:rPr>
-          <w:rFonts w:cs="Calibri" w:ascii="Calibri" w:hAnsi="Calibri"/>
-          <w:lang w:val="en-CA"/>
-        </w:rPr>
         <w:t>Ensured that all voting machines remained operational throughout all polling days.</w:t>
+      </w:r>
+    </w:p>
+    <w:p>
+      <w:pPr>
+        <w:pStyle w:val="Normal"/>
+        <w:rPr>
+          <w:rStyle w:val="NormalBold"/>
+          <w:rFonts w:ascii="Calibri" w:hAnsi="Calibri" w:cs="Calibri"/>
+          <w:lang w:val="en-CA"/>
+        </w:rPr>
+      </w:pPr>
+      <w:r>
+        <w:rPr>
+          <w:rFonts w:cs="Calibri" w:ascii="Calibri" w:hAnsi="Calibri"/>
+          <w:lang w:val="en-CA"/>
+        </w:rPr>
       </w:r>
     </w:p>
     <w:p>
@@ -2118,6 +1763,23 @@
     </w:p>
     <w:p>
       <w:pPr>
+        <w:pStyle w:val="ListParagraph"/>
+        <w:spacing w:before="120" w:after="0"/>
+        <w:rPr>
+          <w:rFonts w:ascii="Calibri" w:hAnsi="Calibri" w:cs="Calibri"/>
+          <w:color w:val="000000"/>
+        </w:rPr>
+      </w:pPr>
+      <w:r>
+        <w:rPr>
+          <w:rFonts w:cs="Calibri" w:ascii="Calibri" w:hAnsi="Calibri"/>
+          <w:color w:val="000000"/>
+        </w:rPr>
+        <w:t>Founded in 1991, Canada Computers &amp; Electronics is a retailer of personal computers, IT and components, as well as consumer electronics.</w:t>
+      </w:r>
+    </w:p>
+    <w:p>
+      <w:pPr>
         <w:pStyle w:val="Normal"/>
         <w:rPr/>
       </w:pPr>
@@ -2141,23 +1803,6 @@
     <w:p>
       <w:pPr>
         <w:pStyle w:val="ListParagraph"/>
-        <w:spacing w:before="120" w:after="0"/>
-        <w:rPr>
-          <w:rFonts w:ascii="Calibri" w:hAnsi="Calibri" w:cs="Calibri"/>
-          <w:color w:val="000000"/>
-        </w:rPr>
-      </w:pPr>
-      <w:r>
-        <w:rPr>
-          <w:rFonts w:cs="Calibri" w:ascii="Calibri" w:hAnsi="Calibri"/>
-          <w:color w:val="000000"/>
-        </w:rPr>
-        <w:t>Founded in 1991, Canada Computers &amp; Electronics is a retailer of personal computers, IT and components, as well as consumer electronics.</w:t>
-      </w:r>
-    </w:p>
-    <w:p>
-      <w:pPr>
-        <w:pStyle w:val="ListParagraph"/>
         <w:rPr/>
       </w:pPr>
       <w:r>
@@ -2299,21 +1944,23 @@
           <w:rFonts w:cs="Calibri" w:ascii="Calibri" w:hAnsi="Calibri"/>
           <w:lang w:val="en-CA"/>
         </w:rPr>
-        <w:t xml:space="preserve">Using MiniTool Partition Wizard, I backed up and migrated </w:t>
-      </w:r>
-      <w:r>
-        <w:rPr>
-          <w:rFonts w:cs="Calibri" w:ascii="Calibri" w:hAnsi="Calibri"/>
-          <w:lang w:val="en-CA"/>
-        </w:rPr>
-        <w:t xml:space="preserve">OS and files </w:t>
-      </w:r>
-      <w:r>
-        <w:rPr>
-          <w:rFonts w:cs="Calibri" w:ascii="Calibri" w:hAnsi="Calibri"/>
-          <w:lang w:val="en-CA"/>
-        </w:rPr>
-        <w:t>to new SSDs and HDDs.</w:t>
+        <w:t>Using MiniTool Partition Wizard, I backed up and migrated OS and files to new SSDs and HDDs.</w:t>
+      </w:r>
+    </w:p>
+    <w:p>
+      <w:pPr>
+        <w:pStyle w:val="Normal"/>
+        <w:rPr>
+          <w:rStyle w:val="NormalBold"/>
+          <w:rFonts w:ascii="Calibri" w:hAnsi="Calibri" w:cs="Calibri"/>
+          <w:lang w:val="en-CA"/>
+        </w:rPr>
+      </w:pPr>
+      <w:r>
+        <w:rPr>
+          <w:rFonts w:cs="Calibri" w:ascii="Calibri" w:hAnsi="Calibri"/>
+          <w:lang w:val="en-CA"/>
+        </w:rPr>
       </w:r>
     </w:p>
     <w:p>
@@ -2341,6 +1988,22 @@
     <w:p>
       <w:pPr>
         <w:pStyle w:val="Normal"/>
+        <w:rPr>
+          <w:rFonts w:ascii="Calibri" w:hAnsi="Calibri" w:cs="Calibri"/>
+          <w:lang w:val="en-CA"/>
+        </w:rPr>
+      </w:pPr>
+      <w:r>
+        <w:rPr>
+          <w:rFonts w:cs="Calibri" w:ascii="Calibri" w:hAnsi="Calibri"/>
+          <w:lang w:val="en-CA"/>
+        </w:rPr>
+        <w:t>Elections Canada is the independent, non-partisan agency responsible for conducting Canadian federal elections and referendums.</w:t>
+      </w:r>
+    </w:p>
+    <w:p>
+      <w:pPr>
+        <w:pStyle w:val="Normal"/>
         <w:rPr/>
       </w:pPr>
       <w:r>
@@ -2363,23 +2026,6 @@
     <w:p>
       <w:pPr>
         <w:pStyle w:val="ListParagraph"/>
-        <w:spacing w:before="0" w:after="0"/>
-        <w:rPr>
-          <w:rFonts w:ascii="Calibri" w:hAnsi="Calibri" w:cs="Calibri"/>
-          <w:lang w:val="en-CA"/>
-        </w:rPr>
-      </w:pPr>
-      <w:r>
-        <w:rPr>
-          <w:rFonts w:cs="Calibri" w:ascii="Calibri" w:hAnsi="Calibri"/>
-          <w:lang w:val="en-CA"/>
-        </w:rPr>
-        <w:t xml:space="preserve">Elections Canada is the independent, non-partisan agency responsible for conducting Canadian federal elections and referendums. </w:t>
-      </w:r>
-    </w:p>
-    <w:p>
-      <w:pPr>
-        <w:pStyle w:val="ListParagraph"/>
         <w:rPr/>
       </w:pPr>
       <w:r>
@@ -2522,42 +2168,7 @@
           <w:lang w:val="en-CA"/>
         </w:rPr>
         <w:tab/>
-      </w:r>
-      <w:r>
-        <w:rPr>
-          <w:rFonts w:cs="Calibri" w:ascii="Calibri" w:hAnsi="Calibri"/>
-          <w:lang w:val="en-CA"/>
-        </w:rPr>
-        <w:t>Newmarket</w:t>
-      </w:r>
-      <w:r>
-        <w:rPr>
-          <w:rFonts w:cs="Calibri" w:ascii="Calibri" w:hAnsi="Calibri"/>
-          <w:lang w:val="en-CA"/>
-        </w:rPr>
-        <w:t>, ON, Canada</w:t>
-      </w:r>
-    </w:p>
-    <w:p>
-      <w:pPr>
-        <w:pStyle w:val="Normal"/>
-        <w:rPr/>
-      </w:pPr>
-      <w:r>
-        <w:rPr>
-          <w:rStyle w:val="NormalItalic"/>
-          <w:rFonts w:cs="Calibri" w:ascii="Calibri" w:hAnsi="Calibri"/>
-          <w:lang w:val="en-CA"/>
-        </w:rPr>
-        <w:t>Sales Associate</w:t>
-      </w:r>
-      <w:r>
-        <w:rPr>
-          <w:rFonts w:cs="Calibri" w:ascii="Calibri" w:hAnsi="Calibri"/>
-          <w:lang w:val="en-CA"/>
-        </w:rPr>
-        <w:tab/>
-        <w:t>May 2008 – August 2008</w:t>
+        <w:t>Newmarket, ON, Canada</w:t>
       </w:r>
     </w:p>
     <w:p>
@@ -2589,27 +2200,23 @@
     <w:p>
       <w:pPr>
         <w:pStyle w:val="Normal"/>
-        <w:tabs>
-          <w:tab w:val="clear" w:pos="9360"/>
-        </w:tabs>
-        <w:spacing w:before="0" w:after="0"/>
-        <w:textAlignment w:val="baseline"/>
-        <w:rPr>
-          <w:rFonts w:ascii="Calibri" w:hAnsi="Calibri" w:eastAsia="Times New Roman" w:cs="Calibri"/>
-          <w:iCs/>
-          <w:kern w:val="0"/>
-          <w:u w:val="single"/>
-          <w:lang w:eastAsia="en-CA"/>
-        </w:rPr>
-      </w:pPr>
-      <w:r>
-        <w:rPr>
-          <w:rFonts w:eastAsia="Times New Roman" w:cs="Calibri" w:ascii="Calibri" w:hAnsi="Calibri"/>
-          <w:iCs/>
-          <w:kern w:val="0"/>
-          <w:u w:val="single"/>
-          <w:lang w:eastAsia="en-CA"/>
-        </w:rPr>
+        <w:rPr/>
+      </w:pPr>
+      <w:r>
+        <w:rPr>
+          <w:rStyle w:val="NormalItalic"/>
+          <w:rFonts w:cs="Calibri" w:ascii="Calibri" w:hAnsi="Calibri"/>
+          <w:lang w:val="en-CA"/>
+        </w:rPr>
+        <w:t>Sales Associate</w:t>
+      </w:r>
+      <w:r>
+        <w:rPr>
+          <w:rFonts w:cs="Calibri" w:ascii="Calibri" w:hAnsi="Calibri"/>
+          <w:lang w:val="en-CA"/>
+        </w:rPr>
+        <w:tab/>
+        <w:t>May 2008 – August 2008</w:t>
       </w:r>
     </w:p>
     <w:p>
@@ -2793,7 +2400,7 @@
       <w:rPr>
         <w:rFonts w:ascii="Calibri" w:hAnsi="Calibri"/>
       </w:rPr>
-      <w:t>3</w:t>
+      <w:t>4</w:t>
     </w:r>
     <w:r>
       <w:rPr>
@@ -2829,7 +2436,7 @@
       <w:rPr>
         <w:rFonts w:ascii="Calibri" w:hAnsi="Calibri"/>
       </w:rPr>
-      <w:t>3</w:t>
+      <w:t>4</w:t>
     </w:r>
     <w:r>
       <w:rPr>

</xml_diff>